<commit_message>
added much more detailed teros testbench documentation
</commit_message>
<xml_diff>
--- a/utils/teros_testbench_bluepill/Software Downloads.docx
+++ b/utils/teros_testbench_bluepill/Software Downloads.docx
@@ -4,6 +4,7 @@
   <w:body>
     <w:p>
       <w:pPr>
+        <w:jc w:val="center"/>
         <w:rPr>
           <w:u w:val="single"/>
         </w:rPr>
@@ -12,7 +13,32 @@
         <w:rPr>
           <w:u w:val="single"/>
         </w:rPr>
-        <w:t>Software Downloads (follow default setup for all):</w:t>
+        <w:t>TEROS12 Testbench Setup</w:t>
+      </w:r>
+    </w:p>
+    <w:p>
+      <w:r>
+        <w:tab/>
+        <w:t>The software setup is intended for Windows.  If you are on a Mac please let me know so I can fix the guide</w:t>
+      </w:r>
+    </w:p>
+    <w:p>
+      <w:pPr>
+        <w:rPr>
+          <w:u w:val="single"/>
+        </w:rPr>
+      </w:pPr>
+      <w:r>
+        <w:rPr>
+          <w:u w:val="single"/>
+        </w:rPr>
+        <w:t>Software Downloads</w:t>
+      </w:r>
+      <w:r>
+        <w:rPr>
+          <w:u w:val="single"/>
+        </w:rPr>
+        <w:t>:</w:t>
       </w:r>
     </w:p>
     <w:p>
@@ -32,27 +58,155 @@
       </w:r>
     </w:p>
     <w:p>
-      <w:r>
+      <w:pPr>
+        <w:pStyle w:val="ListParagraph"/>
+        <w:numPr>
+          <w:ilvl w:val="0"/>
+          <w:numId w:val="2"/>
+        </w:numPr>
+      </w:pPr>
+      <w:r>
+        <w:t xml:space="preserve">Select your operating system and launch the executable file downloaded </w:t>
+      </w:r>
+    </w:p>
+    <w:p>
+      <w:r>
+        <w:drawing>
+          <wp:inline distT="0" distB="0" distL="0" distR="0" wp14:anchorId="64FD11D7" wp14:editId="2762EDE1">
+            <wp:extent cx="5943600" cy="3373755"/>
+            <wp:effectExtent l="0" t="0" r="0" b="0"/>
+            <wp:docPr id="787882438" name="Picture 1"/>
+            <wp:cNvGraphicFramePr>
+              <a:graphicFrameLocks xmlns:a="http://schemas.openxmlformats.org/drawingml/2006/main" noChangeAspect="1"/>
+            </wp:cNvGraphicFramePr>
+            <a:graphic xmlns:a="http://schemas.openxmlformats.org/drawingml/2006/main">
+              <a:graphicData uri="http://schemas.openxmlformats.org/drawingml/2006/picture">
+                <pic:pic xmlns:pic="http://schemas.openxmlformats.org/drawingml/2006/picture">
+                  <pic:nvPicPr>
+                    <pic:cNvPr id="787882438" name=""/>
+                    <pic:cNvPicPr/>
+                  </pic:nvPicPr>
+                  <pic:blipFill>
+                    <a:blip r:embed="rId6"/>
+                    <a:stretch>
+                      <a:fillRect/>
+                    </a:stretch>
+                  </pic:blipFill>
+                  <pic:spPr>
+                    <a:xfrm>
+                      <a:off x="0" y="0"/>
+                      <a:ext cx="5943600" cy="3373755"/>
+                    </a:xfrm>
+                    <a:prstGeom prst="rect">
+                      <a:avLst/>
+                    </a:prstGeom>
+                  </pic:spPr>
+                </pic:pic>
+              </a:graphicData>
+            </a:graphic>
+          </wp:inline>
+        </w:drawing>
+      </w:r>
+    </w:p>
+    <w:p>
+      <w:r>
+        <w:br w:type="page"/>
+      </w:r>
+    </w:p>
+    <w:p>
+      <w:r>
+        <w:lastRenderedPageBreak/>
         <w:t xml:space="preserve">STM32CubeProgrammer: </w:t>
       </w:r>
-      <w:hyperlink r:id="rId6" w:history="1">
+      <w:hyperlink r:id="rId7" w:anchor="section-get-software-table" w:history="1">
         <w:r>
           <w:rPr>
             <w:rStyle w:val="Hyperlink"/>
           </w:rPr>
-          <w:t>https://www.st.com/en/development-tools/stm32cubeprog.html#section-get-software-table</w:t>
+          <w:t>https://w</w:t>
+        </w:r>
+        <w:r>
+          <w:rPr>
+            <w:rStyle w:val="Hyperlink"/>
+          </w:rPr>
+          <w:t>w</w:t>
+        </w:r>
+        <w:r>
+          <w:rPr>
+            <w:rStyle w:val="Hyperlink"/>
+          </w:rPr>
+          <w:t>w.st.com/en/development-tools/stm32cubeprog.html#section-get-software-table</w:t>
         </w:r>
       </w:hyperlink>
-      <w:r>
-        <w:t xml:space="preserve"> (go to “get software”)</w:t>
-      </w:r>
-    </w:p>
-    <w:p>
-      <w:pPr>
+    </w:p>
+    <w:p>
+      <w:pPr>
+        <w:pStyle w:val="ListParagraph"/>
+        <w:numPr>
+          <w:ilvl w:val="0"/>
+          <w:numId w:val="2"/>
+        </w:numPr>
+      </w:pPr>
+      <w:r>
+        <w:t>Go to “Get Software”</w:t>
+      </w:r>
+    </w:p>
+    <w:p>
+      <w:pPr>
+        <w:jc w:val="center"/>
+      </w:pPr>
+      <w:r>
+        <w:drawing>
+          <wp:inline distT="0" distB="0" distL="0" distR="0" wp14:anchorId="5520A3A0" wp14:editId="13B713F5">
+            <wp:extent cx="5343525" cy="3004591"/>
+            <wp:effectExtent l="0" t="0" r="0" b="5715"/>
+            <wp:docPr id="1206165076" name="Picture 1"/>
+            <wp:cNvGraphicFramePr>
+              <a:graphicFrameLocks xmlns:a="http://schemas.openxmlformats.org/drawingml/2006/main" noChangeAspect="1"/>
+            </wp:cNvGraphicFramePr>
+            <a:graphic xmlns:a="http://schemas.openxmlformats.org/drawingml/2006/main">
+              <a:graphicData uri="http://schemas.openxmlformats.org/drawingml/2006/picture">
+                <pic:pic xmlns:pic="http://schemas.openxmlformats.org/drawingml/2006/picture">
+                  <pic:nvPicPr>
+                    <pic:cNvPr id="1206165076" name=""/>
+                    <pic:cNvPicPr/>
+                  </pic:nvPicPr>
+                  <pic:blipFill>
+                    <a:blip r:embed="rId8"/>
+                    <a:stretch>
+                      <a:fillRect/>
+                    </a:stretch>
+                  </pic:blipFill>
+                  <pic:spPr>
+                    <a:xfrm>
+                      <a:off x="0" y="0"/>
+                      <a:ext cx="5350674" cy="3008611"/>
+                    </a:xfrm>
+                    <a:prstGeom prst="rect">
+                      <a:avLst/>
+                    </a:prstGeom>
+                  </pic:spPr>
+                </pic:pic>
+              </a:graphicData>
+            </a:graphic>
+          </wp:inline>
+        </w:drawing>
+      </w:r>
+    </w:p>
+    <w:p>
+      <w:pPr>
+        <w:pStyle w:val="ListParagraph"/>
+        <w:numPr>
+          <w:ilvl w:val="0"/>
+          <w:numId w:val="2"/>
+        </w:numPr>
         <w:rPr>
           <w:u w:val="single"/>
         </w:rPr>
       </w:pPr>
+      <w:r>
+        <w:t>Select your operating System (Win64) and click “Get Latest”</w:t>
+      </w:r>
     </w:p>
     <w:p>
       <w:pPr>
@@ -64,7 +218,334 @@
         <w:rPr>
           <w:u w:val="single"/>
         </w:rPr>
-        <w:t>Software Installation</w:t>
+        <w:drawing>
+          <wp:inline distT="0" distB="0" distL="0" distR="0" wp14:anchorId="20D6D6EE" wp14:editId="413830B2">
+            <wp:extent cx="5943600" cy="2611120"/>
+            <wp:effectExtent l="0" t="0" r="0" b="0"/>
+            <wp:docPr id="1752280908" name="Picture 1"/>
+            <wp:cNvGraphicFramePr>
+              <a:graphicFrameLocks xmlns:a="http://schemas.openxmlformats.org/drawingml/2006/main" noChangeAspect="1"/>
+            </wp:cNvGraphicFramePr>
+            <a:graphic xmlns:a="http://schemas.openxmlformats.org/drawingml/2006/main">
+              <a:graphicData uri="http://schemas.openxmlformats.org/drawingml/2006/picture">
+                <pic:pic xmlns:pic="http://schemas.openxmlformats.org/drawingml/2006/picture">
+                  <pic:nvPicPr>
+                    <pic:cNvPr id="1752280908" name=""/>
+                    <pic:cNvPicPr/>
+                  </pic:nvPicPr>
+                  <pic:blipFill>
+                    <a:blip r:embed="rId9"/>
+                    <a:stretch>
+                      <a:fillRect/>
+                    </a:stretch>
+                  </pic:blipFill>
+                  <pic:spPr>
+                    <a:xfrm>
+                      <a:off x="0" y="0"/>
+                      <a:ext cx="5943600" cy="2611120"/>
+                    </a:xfrm>
+                    <a:prstGeom prst="rect">
+                      <a:avLst/>
+                    </a:prstGeom>
+                  </pic:spPr>
+                </pic:pic>
+              </a:graphicData>
+            </a:graphic>
+          </wp:inline>
+        </w:drawing>
+      </w:r>
+    </w:p>
+    <w:p>
+      <w:pPr>
+        <w:pStyle w:val="ListParagraph"/>
+        <w:numPr>
+          <w:ilvl w:val="0"/>
+          <w:numId w:val="2"/>
+        </w:numPr>
+        <w:rPr>
+          <w:u w:val="single"/>
+        </w:rPr>
+      </w:pPr>
+      <w:r>
+        <w:t>Accept the license terms</w:t>
+      </w:r>
+    </w:p>
+    <w:p>
+      <w:pPr>
+        <w:pStyle w:val="ListParagraph"/>
+        <w:numPr>
+          <w:ilvl w:val="0"/>
+          <w:numId w:val="2"/>
+        </w:numPr>
+        <w:rPr>
+          <w:u w:val="single"/>
+        </w:rPr>
+      </w:pPr>
+      <w:r>
+        <w:t>When prompted, click “Download as a guest”</w:t>
+      </w:r>
+    </w:p>
+    <w:p>
+      <w:pPr>
+        <w:rPr>
+          <w:u w:val="single"/>
+        </w:rPr>
+      </w:pPr>
+      <w:r>
+        <w:rPr>
+          <w:u w:val="single"/>
+        </w:rPr>
+        <w:lastRenderedPageBreak/>
+        <w:drawing>
+          <wp:inline distT="0" distB="0" distL="0" distR="0" wp14:anchorId="5EC9A16E" wp14:editId="674B85FC">
+            <wp:extent cx="5943600" cy="4794885"/>
+            <wp:effectExtent l="0" t="0" r="0" b="5715"/>
+            <wp:docPr id="174648475" name="Picture 1"/>
+            <wp:cNvGraphicFramePr>
+              <a:graphicFrameLocks xmlns:a="http://schemas.openxmlformats.org/drawingml/2006/main" noChangeAspect="1"/>
+            </wp:cNvGraphicFramePr>
+            <a:graphic xmlns:a="http://schemas.openxmlformats.org/drawingml/2006/main">
+              <a:graphicData uri="http://schemas.openxmlformats.org/drawingml/2006/picture">
+                <pic:pic xmlns:pic="http://schemas.openxmlformats.org/drawingml/2006/picture">
+                  <pic:nvPicPr>
+                    <pic:cNvPr id="174648475" name=""/>
+                    <pic:cNvPicPr/>
+                  </pic:nvPicPr>
+                  <pic:blipFill>
+                    <a:blip r:embed="rId10"/>
+                    <a:stretch>
+                      <a:fillRect/>
+                    </a:stretch>
+                  </pic:blipFill>
+                  <pic:spPr>
+                    <a:xfrm>
+                      <a:off x="0" y="0"/>
+                      <a:ext cx="5943600" cy="4794885"/>
+                    </a:xfrm>
+                    <a:prstGeom prst="rect">
+                      <a:avLst/>
+                    </a:prstGeom>
+                  </pic:spPr>
+                </pic:pic>
+              </a:graphicData>
+            </a:graphic>
+          </wp:inline>
+        </w:drawing>
+      </w:r>
+    </w:p>
+    <w:p>
+      <w:pPr>
+        <w:rPr>
+          <w:u w:val="single"/>
+        </w:rPr>
+      </w:pPr>
+      <w:r>
+        <w:rPr>
+          <w:u w:val="single"/>
+        </w:rPr>
+        <w:br w:type="page"/>
+      </w:r>
+    </w:p>
+    <w:p>
+      <w:pPr>
+        <w:rPr>
+          <w:u w:val="single"/>
+        </w:rPr>
+      </w:pPr>
+    </w:p>
+    <w:p>
+      <w:pPr>
+        <w:pStyle w:val="ListParagraph"/>
+        <w:numPr>
+          <w:ilvl w:val="0"/>
+          <w:numId w:val="2"/>
+        </w:numPr>
+        <w:rPr>
+          <w:u w:val="single"/>
+        </w:rPr>
+      </w:pPr>
+      <w:r>
+        <w:t>Enter your name and email (I used my McMaster email for this).  Do NOT click to get future updates about the software.  Then click “Get Link to Download”</w:t>
+      </w:r>
+    </w:p>
+    <w:p>
+      <w:pPr>
+        <w:rPr>
+          <w:u w:val="single"/>
+        </w:rPr>
+      </w:pPr>
+    </w:p>
+    <w:p>
+      <w:pPr>
+        <w:pStyle w:val="ListParagraph"/>
+        <w:numPr>
+          <w:ilvl w:val="0"/>
+          <w:numId w:val="2"/>
+        </w:numPr>
+        <w:rPr>
+          <w:u w:val="single"/>
+        </w:rPr>
+      </w:pPr>
+      <w:r>
+        <w:t>Open your email where you should have a link to the installer.  Click “Download Now”</w:t>
+      </w:r>
+    </w:p>
+    <w:p>
+      <w:pPr>
+        <w:rPr>
+          <w:u w:val="single"/>
+        </w:rPr>
+      </w:pPr>
+      <w:r>
+        <w:rPr>
+          <w:u w:val="single"/>
+        </w:rPr>
+        <w:drawing>
+          <wp:inline distT="0" distB="0" distL="0" distR="0" wp14:anchorId="0E5AA19C" wp14:editId="3A564D52">
+            <wp:extent cx="5943600" cy="2724785"/>
+            <wp:effectExtent l="0" t="0" r="0" b="0"/>
+            <wp:docPr id="1509837414" name="Picture 1"/>
+            <wp:cNvGraphicFramePr>
+              <a:graphicFrameLocks xmlns:a="http://schemas.openxmlformats.org/drawingml/2006/main" noChangeAspect="1"/>
+            </wp:cNvGraphicFramePr>
+            <a:graphic xmlns:a="http://schemas.openxmlformats.org/drawingml/2006/main">
+              <a:graphicData uri="http://schemas.openxmlformats.org/drawingml/2006/picture">
+                <pic:pic xmlns:pic="http://schemas.openxmlformats.org/drawingml/2006/picture">
+                  <pic:nvPicPr>
+                    <pic:cNvPr id="1509837414" name=""/>
+                    <pic:cNvPicPr/>
+                  </pic:nvPicPr>
+                  <pic:blipFill>
+                    <a:blip r:embed="rId11"/>
+                    <a:stretch>
+                      <a:fillRect/>
+                    </a:stretch>
+                  </pic:blipFill>
+                  <pic:spPr>
+                    <a:xfrm>
+                      <a:off x="0" y="0"/>
+                      <a:ext cx="5943600" cy="2724785"/>
+                    </a:xfrm>
+                    <a:prstGeom prst="rect">
+                      <a:avLst/>
+                    </a:prstGeom>
+                  </pic:spPr>
+                </pic:pic>
+              </a:graphicData>
+            </a:graphic>
+          </wp:inline>
+        </w:drawing>
+      </w:r>
+    </w:p>
+    <w:p>
+      <w:pPr>
+        <w:pStyle w:val="ListParagraph"/>
+        <w:numPr>
+          <w:ilvl w:val="0"/>
+          <w:numId w:val="2"/>
+        </w:numPr>
+        <w:rPr>
+          <w:u w:val="single"/>
+        </w:rPr>
+      </w:pPr>
+      <w:r>
+        <w:t>Unzip the file (Right Click &gt; Extract All).</w:t>
+      </w:r>
+    </w:p>
+    <w:p>
+      <w:pPr>
+        <w:pStyle w:val="ListParagraph"/>
+        <w:numPr>
+          <w:ilvl w:val="0"/>
+          <w:numId w:val="2"/>
+        </w:numPr>
+        <w:rPr>
+          <w:u w:val="single"/>
+        </w:rPr>
+      </w:pPr>
+      <w:r>
+        <w:t>In the unzipped folder, run the installer inside and follow all the default setup</w:t>
+      </w:r>
+    </w:p>
+    <w:p>
+      <w:pPr>
+        <w:rPr>
+          <w:u w:val="single"/>
+        </w:rPr>
+      </w:pPr>
+      <w:r>
+        <w:rPr>
+          <w:u w:val="single"/>
+        </w:rPr>
+        <w:drawing>
+          <wp:inline distT="0" distB="0" distL="0" distR="0" wp14:anchorId="60807FE7" wp14:editId="7D65595C">
+            <wp:extent cx="5943600" cy="1057910"/>
+            <wp:effectExtent l="0" t="0" r="0" b="8890"/>
+            <wp:docPr id="1105091865" name="Picture 1"/>
+            <wp:cNvGraphicFramePr>
+              <a:graphicFrameLocks xmlns:a="http://schemas.openxmlformats.org/drawingml/2006/main" noChangeAspect="1"/>
+            </wp:cNvGraphicFramePr>
+            <a:graphic xmlns:a="http://schemas.openxmlformats.org/drawingml/2006/main">
+              <a:graphicData uri="http://schemas.openxmlformats.org/drawingml/2006/picture">
+                <pic:pic xmlns:pic="http://schemas.openxmlformats.org/drawingml/2006/picture">
+                  <pic:nvPicPr>
+                    <pic:cNvPr id="1105091865" name=""/>
+                    <pic:cNvPicPr/>
+                  </pic:nvPicPr>
+                  <pic:blipFill>
+                    <a:blip r:embed="rId12"/>
+                    <a:stretch>
+                      <a:fillRect/>
+                    </a:stretch>
+                  </pic:blipFill>
+                  <pic:spPr>
+                    <a:xfrm>
+                      <a:off x="0" y="0"/>
+                      <a:ext cx="5943600" cy="1057910"/>
+                    </a:xfrm>
+                    <a:prstGeom prst="rect">
+                      <a:avLst/>
+                    </a:prstGeom>
+                  </pic:spPr>
+                </pic:pic>
+              </a:graphicData>
+            </a:graphic>
+          </wp:inline>
+        </w:drawing>
+      </w:r>
+    </w:p>
+    <w:p>
+      <w:pPr>
+        <w:rPr>
+          <w:u w:val="single"/>
+        </w:rPr>
+      </w:pPr>
+    </w:p>
+    <w:p>
+      <w:pPr>
+        <w:rPr>
+          <w:u w:val="single"/>
+        </w:rPr>
+      </w:pPr>
+      <w:r>
+        <w:rPr>
+          <w:u w:val="single"/>
+        </w:rPr>
+        <w:br w:type="page"/>
+      </w:r>
+    </w:p>
+    <w:p>
+      <w:pPr>
+        <w:rPr>
+          <w:u w:val="single"/>
+        </w:rPr>
+      </w:pPr>
+      <w:r>
+        <w:rPr>
+          <w:u w:val="single"/>
+        </w:rPr>
+        <w:lastRenderedPageBreak/>
+        <w:t>STM32Duino Configuration</w:t>
       </w:r>
     </w:p>
     <w:p>
@@ -87,6 +568,54 @@
     </w:p>
     <w:p>
       <w:pPr>
+        <w:jc w:val="center"/>
+        <w:rPr>
+          <w:lang w:val="en-US"/>
+        </w:rPr>
+      </w:pPr>
+      <w:r>
+        <w:rPr>
+          <w:lang w:val="en-US"/>
+        </w:rPr>
+        <w:drawing>
+          <wp:inline distT="0" distB="0" distL="0" distR="0" wp14:anchorId="6F23E2B3" wp14:editId="0678E142">
+            <wp:extent cx="5191125" cy="3814590"/>
+            <wp:effectExtent l="0" t="0" r="0" b="0"/>
+            <wp:docPr id="606474630" name="Picture 1"/>
+            <wp:cNvGraphicFramePr>
+              <a:graphicFrameLocks xmlns:a="http://schemas.openxmlformats.org/drawingml/2006/main" noChangeAspect="1"/>
+            </wp:cNvGraphicFramePr>
+            <a:graphic xmlns:a="http://schemas.openxmlformats.org/drawingml/2006/main">
+              <a:graphicData uri="http://schemas.openxmlformats.org/drawingml/2006/picture">
+                <pic:pic xmlns:pic="http://schemas.openxmlformats.org/drawingml/2006/picture">
+                  <pic:nvPicPr>
+                    <pic:cNvPr id="606474630" name=""/>
+                    <pic:cNvPicPr/>
+                  </pic:nvPicPr>
+                  <pic:blipFill>
+                    <a:blip r:embed="rId13"/>
+                    <a:stretch>
+                      <a:fillRect/>
+                    </a:stretch>
+                  </pic:blipFill>
+                  <pic:spPr>
+                    <a:xfrm>
+                      <a:off x="0" y="0"/>
+                      <a:ext cx="5203334" cy="3823561"/>
+                    </a:xfrm>
+                    <a:prstGeom prst="rect">
+                      <a:avLst/>
+                    </a:prstGeom>
+                  </pic:spPr>
+                </pic:pic>
+              </a:graphicData>
+            </a:graphic>
+          </wp:inline>
+        </w:drawing>
+      </w:r>
+    </w:p>
+    <w:p>
+      <w:pPr>
         <w:pStyle w:val="ListParagraph"/>
         <w:numPr>
           <w:ilvl w:val="0"/>
@@ -100,7 +629,39 @@
         <w:rPr>
           <w:lang w:val="en-US"/>
         </w:rPr>
-        <w:t>Go to File &gt; Preferences</w:t>
+        <w:t xml:space="preserve">Once opened, a blank file will open.  </w:t>
+      </w:r>
+      <w:r>
+        <w:rPr>
+          <w:lang w:val="en-US"/>
+        </w:rPr>
+        <w:t xml:space="preserve">Click on File &gt; Open and navigate to the directory where you downloaded the TEROS12 code.  </w:t>
+      </w:r>
+      <w:r>
+        <w:rPr>
+          <w:b/>
+          <w:bCs/>
+          <w:lang w:val="en-US"/>
+        </w:rPr>
+        <w:t xml:space="preserve">Select </w:t>
+      </w:r>
+      <w:proofErr w:type="spellStart"/>
+      <w:r>
+        <w:rPr>
+          <w:b/>
+          <w:bCs/>
+          <w:lang w:val="en-US"/>
+        </w:rPr>
+        <w:t>teros_testbench_bluepill.ino</w:t>
+      </w:r>
+      <w:proofErr w:type="spellEnd"/>
+      <w:r>
+        <w:rPr>
+          <w:b/>
+          <w:bCs/>
+          <w:lang w:val="en-US"/>
+        </w:rPr>
+        <w:t xml:space="preserve"> and click open</w:t>
       </w:r>
     </w:p>
     <w:p>
@@ -118,9 +679,167 @@
         <w:rPr>
           <w:lang w:val="en-US"/>
         </w:rPr>
-        <w:t xml:space="preserve">In the “Additional Boards Manager URLs field” paste: </w:t>
-      </w:r>
-      <w:hyperlink r:id="rId7" w:history="1">
+        <w:t>The file should then open, and look something like this</w:t>
+      </w:r>
+    </w:p>
+    <w:p>
+      <w:pPr>
+        <w:jc w:val="center"/>
+        <w:rPr>
+          <w:lang w:val="en-US"/>
+        </w:rPr>
+      </w:pPr>
+      <w:r>
+        <w:rPr>
+          <w:lang w:val="en-US"/>
+        </w:rPr>
+        <w:drawing>
+          <wp:inline distT="0" distB="0" distL="0" distR="0" wp14:anchorId="590E148F" wp14:editId="733C3009">
+            <wp:extent cx="3781425" cy="2126244"/>
+            <wp:effectExtent l="0" t="0" r="0" b="7620"/>
+            <wp:docPr id="1909620799" name="Picture 1"/>
+            <wp:cNvGraphicFramePr>
+              <a:graphicFrameLocks xmlns:a="http://schemas.openxmlformats.org/drawingml/2006/main" noChangeAspect="1"/>
+            </wp:cNvGraphicFramePr>
+            <a:graphic xmlns:a="http://schemas.openxmlformats.org/drawingml/2006/main">
+              <a:graphicData uri="http://schemas.openxmlformats.org/drawingml/2006/picture">
+                <pic:pic xmlns:pic="http://schemas.openxmlformats.org/drawingml/2006/picture">
+                  <pic:nvPicPr>
+                    <pic:cNvPr id="1909620799" name=""/>
+                    <pic:cNvPicPr/>
+                  </pic:nvPicPr>
+                  <pic:blipFill>
+                    <a:blip r:embed="rId14"/>
+                    <a:stretch>
+                      <a:fillRect/>
+                    </a:stretch>
+                  </pic:blipFill>
+                  <pic:spPr>
+                    <a:xfrm>
+                      <a:off x="0" y="0"/>
+                      <a:ext cx="3784525" cy="2127987"/>
+                    </a:xfrm>
+                    <a:prstGeom prst="rect">
+                      <a:avLst/>
+                    </a:prstGeom>
+                  </pic:spPr>
+                </pic:pic>
+              </a:graphicData>
+            </a:graphic>
+          </wp:inline>
+        </w:drawing>
+      </w:r>
+    </w:p>
+    <w:p>
+      <w:pPr>
+        <w:rPr>
+          <w:lang w:val="en-US"/>
+        </w:rPr>
+      </w:pPr>
+      <w:r>
+        <w:rPr>
+          <w:lang w:val="en-US"/>
+        </w:rPr>
+        <w:t>The following steps will walk through how to configure the STM32Duino environment.</w:t>
+      </w:r>
+    </w:p>
+    <w:p>
+      <w:pPr>
+        <w:pStyle w:val="ListParagraph"/>
+        <w:numPr>
+          <w:ilvl w:val="0"/>
+          <w:numId w:val="1"/>
+        </w:numPr>
+        <w:rPr>
+          <w:lang w:val="en-US"/>
+        </w:rPr>
+      </w:pPr>
+      <w:r>
+        <w:rPr>
+          <w:lang w:val="en-US"/>
+        </w:rPr>
+        <w:lastRenderedPageBreak/>
+        <w:t>Go to File &gt; Preferences</w:t>
+      </w:r>
+    </w:p>
+    <w:p>
+      <w:pPr>
+        <w:jc w:val="center"/>
+        <w:rPr>
+          <w:lang w:val="en-US"/>
+        </w:rPr>
+      </w:pPr>
+      <w:r>
+        <w:rPr>
+          <w:lang w:val="en-US"/>
+        </w:rPr>
+        <w:drawing>
+          <wp:inline distT="0" distB="0" distL="0" distR="0" wp14:anchorId="66578B00" wp14:editId="477C667A">
+            <wp:extent cx="2191056" cy="3505689"/>
+            <wp:effectExtent l="0" t="0" r="0" b="0"/>
+            <wp:docPr id="684765987" name="Picture 1"/>
+            <wp:cNvGraphicFramePr>
+              <a:graphicFrameLocks xmlns:a="http://schemas.openxmlformats.org/drawingml/2006/main" noChangeAspect="1"/>
+            </wp:cNvGraphicFramePr>
+            <a:graphic xmlns:a="http://schemas.openxmlformats.org/drawingml/2006/main">
+              <a:graphicData uri="http://schemas.openxmlformats.org/drawingml/2006/picture">
+                <pic:pic xmlns:pic="http://schemas.openxmlformats.org/drawingml/2006/picture">
+                  <pic:nvPicPr>
+                    <pic:cNvPr id="684765987" name=""/>
+                    <pic:cNvPicPr/>
+                  </pic:nvPicPr>
+                  <pic:blipFill>
+                    <a:blip r:embed="rId15"/>
+                    <a:stretch>
+                      <a:fillRect/>
+                    </a:stretch>
+                  </pic:blipFill>
+                  <pic:spPr>
+                    <a:xfrm>
+                      <a:off x="0" y="0"/>
+                      <a:ext cx="2191056" cy="3505689"/>
+                    </a:xfrm>
+                    <a:prstGeom prst="rect">
+                      <a:avLst/>
+                    </a:prstGeom>
+                  </pic:spPr>
+                </pic:pic>
+              </a:graphicData>
+            </a:graphic>
+          </wp:inline>
+        </w:drawing>
+      </w:r>
+    </w:p>
+    <w:p>
+      <w:pPr>
+        <w:pStyle w:val="ListParagraph"/>
+        <w:numPr>
+          <w:ilvl w:val="0"/>
+          <w:numId w:val="1"/>
+        </w:numPr>
+        <w:rPr>
+          <w:lang w:val="en-US"/>
+        </w:rPr>
+      </w:pPr>
+      <w:r>
+        <w:rPr>
+          <w:lang w:val="en-US"/>
+        </w:rPr>
+        <w:t>In the “Additional Boards Manager URLs field” paste</w:t>
+      </w:r>
+      <w:r>
+        <w:rPr>
+          <w:lang w:val="en-US"/>
+        </w:rPr>
+        <w:t xml:space="preserve"> the following URL</w:t>
+      </w:r>
+      <w:r>
+        <w:rPr>
+          <w:lang w:val="en-US"/>
+        </w:rPr>
+        <w:t xml:space="preserve">: </w:t>
+      </w:r>
+      <w:hyperlink r:id="rId16" w:history="1">
         <w:r>
           <w:rPr>
             <w:rStyle w:val="Hyperlink"/>
@@ -128,6 +847,57 @@
           <w:t>https://github.com/stm32duino/BoardManagerFiles/raw/main/package_stmicroelectronics_index.json</w:t>
         </w:r>
       </w:hyperlink>
+      <w:r>
+        <w:t>.  Following this, click OK.</w:t>
+      </w:r>
+    </w:p>
+    <w:p>
+      <w:pPr>
+        <w:jc w:val="center"/>
+        <w:rPr>
+          <w:lang w:val="en-US"/>
+        </w:rPr>
+      </w:pPr>
+      <w:r>
+        <w:rPr>
+          <w:lang w:val="en-US"/>
+        </w:rPr>
+        <w:drawing>
+          <wp:inline distT="0" distB="0" distL="0" distR="0" wp14:anchorId="2D6438A0" wp14:editId="25BD0033">
+            <wp:extent cx="4980267" cy="3286125"/>
+            <wp:effectExtent l="0" t="0" r="0" b="0"/>
+            <wp:docPr id="1731842061" name="Picture 1"/>
+            <wp:cNvGraphicFramePr>
+              <a:graphicFrameLocks xmlns:a="http://schemas.openxmlformats.org/drawingml/2006/main" noChangeAspect="1"/>
+            </wp:cNvGraphicFramePr>
+            <a:graphic xmlns:a="http://schemas.openxmlformats.org/drawingml/2006/main">
+              <a:graphicData uri="http://schemas.openxmlformats.org/drawingml/2006/picture">
+                <pic:pic xmlns:pic="http://schemas.openxmlformats.org/drawingml/2006/picture">
+                  <pic:nvPicPr>
+                    <pic:cNvPr id="1731842061" name=""/>
+                    <pic:cNvPicPr/>
+                  </pic:nvPicPr>
+                  <pic:blipFill>
+                    <a:blip r:embed="rId17"/>
+                    <a:stretch>
+                      <a:fillRect/>
+                    </a:stretch>
+                  </pic:blipFill>
+                  <pic:spPr>
+                    <a:xfrm>
+                      <a:off x="0" y="0"/>
+                      <a:ext cx="4986187" cy="3290031"/>
+                    </a:xfrm>
+                    <a:prstGeom prst="rect">
+                      <a:avLst/>
+                    </a:prstGeom>
+                  </pic:spPr>
+                </pic:pic>
+              </a:graphicData>
+            </a:graphic>
+          </wp:inline>
+        </w:drawing>
+      </w:r>
     </w:p>
     <w:p>
       <w:pPr>
@@ -141,7 +911,64 @@
         </w:rPr>
       </w:pPr>
       <w:r>
-        <w:t>Click OK</w:t>
+        <w:lastRenderedPageBreak/>
+        <w:t xml:space="preserve">Next, click on </w:t>
+      </w:r>
+      <w:r>
+        <w:t>Tools &gt; Board &gt; Boards Manager</w:t>
+      </w:r>
+    </w:p>
+    <w:p>
+      <w:pPr>
+        <w:jc w:val="center"/>
+        <w:rPr>
+          <w:lang w:val="en-US"/>
+        </w:rPr>
+      </w:pPr>
+      <w:r>
+        <w:rPr>
+          <w:lang w:val="en-US"/>
+        </w:rPr>
+        <w:drawing>
+          <wp:inline distT="0" distB="0" distL="0" distR="0" wp14:anchorId="1E75FAE5" wp14:editId="2F26F218">
+            <wp:extent cx="5925377" cy="3524742"/>
+            <wp:effectExtent l="0" t="0" r="0" b="0"/>
+            <wp:docPr id="2128661290" name="Picture 1"/>
+            <wp:cNvGraphicFramePr>
+              <a:graphicFrameLocks xmlns:a="http://schemas.openxmlformats.org/drawingml/2006/main" noChangeAspect="1"/>
+            </wp:cNvGraphicFramePr>
+            <a:graphic xmlns:a="http://schemas.openxmlformats.org/drawingml/2006/main">
+              <a:graphicData uri="http://schemas.openxmlformats.org/drawingml/2006/picture">
+                <pic:pic xmlns:pic="http://schemas.openxmlformats.org/drawingml/2006/picture">
+                  <pic:nvPicPr>
+                    <pic:cNvPr id="2128661290" name=""/>
+                    <pic:cNvPicPr/>
+                  </pic:nvPicPr>
+                  <pic:blipFill>
+                    <a:blip r:embed="rId18"/>
+                    <a:stretch>
+                      <a:fillRect/>
+                    </a:stretch>
+                  </pic:blipFill>
+                  <pic:spPr>
+                    <a:xfrm>
+                      <a:off x="0" y="0"/>
+                      <a:ext cx="5925377" cy="3524742"/>
+                    </a:xfrm>
+                    <a:prstGeom prst="rect">
+                      <a:avLst/>
+                    </a:prstGeom>
+                  </pic:spPr>
+                </pic:pic>
+              </a:graphicData>
+            </a:graphic>
+          </wp:inline>
+        </w:drawing>
+      </w:r>
+    </w:p>
+    <w:p>
+      <w:r>
+        <w:br w:type="page"/>
       </w:r>
     </w:p>
     <w:p>
@@ -156,8 +983,94 @@
         </w:rPr>
       </w:pPr>
       <w:r>
-        <w:t>Tools &gt; Board &gt; Boards Manager</w:t>
-      </w:r>
+        <w:lastRenderedPageBreak/>
+        <w:t>Search for STM32, find the package named STM32MCU and install it</w:t>
+      </w:r>
+      <w:r>
+        <w:t xml:space="preserve"> </w:t>
+      </w:r>
+      <w:r>
+        <w:t xml:space="preserve">(install the latest version.  Make sure it says STM32, and </w:t>
+      </w:r>
+      <w:r>
+        <w:rPr>
+          <w:b/>
+          <w:bCs/>
+        </w:rPr>
+        <w:t>not</w:t>
+      </w:r>
+      <w:r>
+        <w:t xml:space="preserve"> STM8.  Once this is done, let the install run</w:t>
+      </w:r>
+    </w:p>
+    <w:p>
+      <w:pPr>
+        <w:jc w:val="center"/>
+        <w:rPr>
+          <w:lang w:val="en-US"/>
+        </w:rPr>
+      </w:pPr>
+      <w:r>
+        <w:rPr>
+          <w:lang w:val="en-US"/>
+        </w:rPr>
+        <w:drawing>
+          <wp:inline distT="0" distB="0" distL="0" distR="0" wp14:anchorId="6BAC70F1" wp14:editId="5175C8A8">
+            <wp:extent cx="2238687" cy="4658375"/>
+            <wp:effectExtent l="0" t="0" r="9525" b="8890"/>
+            <wp:docPr id="1491940098" name="Picture 1"/>
+            <wp:cNvGraphicFramePr>
+              <a:graphicFrameLocks xmlns:a="http://schemas.openxmlformats.org/drawingml/2006/main" noChangeAspect="1"/>
+            </wp:cNvGraphicFramePr>
+            <a:graphic xmlns:a="http://schemas.openxmlformats.org/drawingml/2006/main">
+              <a:graphicData uri="http://schemas.openxmlformats.org/drawingml/2006/picture">
+                <pic:pic xmlns:pic="http://schemas.openxmlformats.org/drawingml/2006/picture">
+                  <pic:nvPicPr>
+                    <pic:cNvPr id="1491940098" name=""/>
+                    <pic:cNvPicPr/>
+                  </pic:nvPicPr>
+                  <pic:blipFill>
+                    <a:blip r:embed="rId19"/>
+                    <a:stretch>
+                      <a:fillRect/>
+                    </a:stretch>
+                  </pic:blipFill>
+                  <pic:spPr>
+                    <a:xfrm>
+                      <a:off x="0" y="0"/>
+                      <a:ext cx="2238687" cy="4658375"/>
+                    </a:xfrm>
+                    <a:prstGeom prst="rect">
+                      <a:avLst/>
+                    </a:prstGeom>
+                  </pic:spPr>
+                </pic:pic>
+              </a:graphicData>
+            </a:graphic>
+          </wp:inline>
+        </w:drawing>
+      </w:r>
+    </w:p>
+    <w:p>
+      <w:pPr>
+        <w:rPr>
+          <w:lang w:val="en-US"/>
+        </w:rPr>
+      </w:pPr>
+      <w:r>
+        <w:rPr>
+          <w:lang w:val="en-US"/>
+        </w:rPr>
+        <w:br w:type="page"/>
+      </w:r>
+    </w:p>
+    <w:p>
+      <w:pPr>
+        <w:jc w:val="center"/>
+        <w:rPr>
+          <w:lang w:val="en-US"/>
+        </w:rPr>
+      </w:pPr>
     </w:p>
     <w:p>
       <w:pPr>
@@ -171,10 +1084,57 @@
         </w:rPr>
       </w:pPr>
       <w:r>
-        <w:t>Search for STM32, find the package named STM32MCU and install it</w:t>
-      </w:r>
-      <w:r>
-        <w:t xml:space="preserve"> (latest version</w:t>
+        <w:rPr>
+          <w:lang w:val="en-US"/>
+        </w:rPr>
+        <w:t>The installation will be finished when you see the following messages, as well as the “Remove” button beside “STM32 MCU based boards” (do not hit the remove button)</w:t>
+      </w:r>
+    </w:p>
+    <w:p>
+      <w:pPr>
+        <w:rPr>
+          <w:lang w:val="en-US"/>
+        </w:rPr>
+      </w:pPr>
+      <w:r>
+        <w:rPr>
+          <w:lang w:val="en-US"/>
+        </w:rPr>
+        <w:drawing>
+          <wp:inline distT="0" distB="0" distL="0" distR="0" wp14:anchorId="06C617DA" wp14:editId="4F127A2F">
+            <wp:extent cx="5943600" cy="2608580"/>
+            <wp:effectExtent l="0" t="0" r="0" b="1270"/>
+            <wp:docPr id="1168456705" name="Picture 1"/>
+            <wp:cNvGraphicFramePr>
+              <a:graphicFrameLocks xmlns:a="http://schemas.openxmlformats.org/drawingml/2006/main" noChangeAspect="1"/>
+            </wp:cNvGraphicFramePr>
+            <a:graphic xmlns:a="http://schemas.openxmlformats.org/drawingml/2006/main">
+              <a:graphicData uri="http://schemas.openxmlformats.org/drawingml/2006/picture">
+                <pic:pic xmlns:pic="http://schemas.openxmlformats.org/drawingml/2006/picture">
+                  <pic:nvPicPr>
+                    <pic:cNvPr id="1168456705" name=""/>
+                    <pic:cNvPicPr/>
+                  </pic:nvPicPr>
+                  <pic:blipFill>
+                    <a:blip r:embed="rId20"/>
+                    <a:stretch>
+                      <a:fillRect/>
+                    </a:stretch>
+                  </pic:blipFill>
+                  <pic:spPr>
+                    <a:xfrm>
+                      <a:off x="0" y="0"/>
+                      <a:ext cx="5943600" cy="2608580"/>
+                    </a:xfrm>
+                    <a:prstGeom prst="rect">
+                      <a:avLst/>
+                    </a:prstGeom>
+                  </pic:spPr>
+                </pic:pic>
+              </a:graphicData>
+            </a:graphic>
+          </wp:inline>
+        </w:drawing>
       </w:r>
     </w:p>
     <w:p>
@@ -189,8 +1149,506 @@
         </w:rPr>
       </w:pPr>
       <w:r>
-        <w:t>Let it install</w:t>
-      </w:r>
+        <w:t>Once installation is done, go to Tools &gt; Board &gt; STM32 MCU Based Boards</w:t>
+      </w:r>
+    </w:p>
+    <w:p>
+      <w:pPr>
+        <w:pStyle w:val="ListParagraph"/>
+        <w:numPr>
+          <w:ilvl w:val="1"/>
+          <w:numId w:val="1"/>
+        </w:numPr>
+        <w:rPr>
+          <w:lang w:val="en-US"/>
+        </w:rPr>
+      </w:pPr>
+      <w:r>
+        <w:t>Select Generic STM32F1</w:t>
+      </w:r>
+    </w:p>
+    <w:p>
+      <w:pPr>
+        <w:rPr>
+          <w:lang w:val="en-US"/>
+        </w:rPr>
+      </w:pPr>
+      <w:r>
+        <w:rPr>
+          <w:lang w:val="en-US"/>
+        </w:rPr>
+        <w:drawing>
+          <wp:inline distT="0" distB="0" distL="0" distR="0" wp14:anchorId="78B336B2" wp14:editId="504BC82A">
+            <wp:extent cx="5943600" cy="3342005"/>
+            <wp:effectExtent l="0" t="0" r="0" b="0"/>
+            <wp:docPr id="2141268833" name="Picture 1"/>
+            <wp:cNvGraphicFramePr>
+              <a:graphicFrameLocks xmlns:a="http://schemas.openxmlformats.org/drawingml/2006/main" noChangeAspect="1"/>
+            </wp:cNvGraphicFramePr>
+            <a:graphic xmlns:a="http://schemas.openxmlformats.org/drawingml/2006/main">
+              <a:graphicData uri="http://schemas.openxmlformats.org/drawingml/2006/picture">
+                <pic:pic xmlns:pic="http://schemas.openxmlformats.org/drawingml/2006/picture">
+                  <pic:nvPicPr>
+                    <pic:cNvPr id="2141268833" name=""/>
+                    <pic:cNvPicPr/>
+                  </pic:nvPicPr>
+                  <pic:blipFill>
+                    <a:blip r:embed="rId21"/>
+                    <a:stretch>
+                      <a:fillRect/>
+                    </a:stretch>
+                  </pic:blipFill>
+                  <pic:spPr>
+                    <a:xfrm>
+                      <a:off x="0" y="0"/>
+                      <a:ext cx="5943600" cy="3342005"/>
+                    </a:xfrm>
+                    <a:prstGeom prst="rect">
+                      <a:avLst/>
+                    </a:prstGeom>
+                  </pic:spPr>
+                </pic:pic>
+              </a:graphicData>
+            </a:graphic>
+          </wp:inline>
+        </w:drawing>
+      </w:r>
+    </w:p>
+    <w:p>
+      <w:r>
+        <w:br w:type="page"/>
+      </w:r>
+    </w:p>
+    <w:p>
+      <w:pPr>
+        <w:pStyle w:val="ListParagraph"/>
+        <w:numPr>
+          <w:ilvl w:val="1"/>
+          <w:numId w:val="1"/>
+        </w:numPr>
+        <w:rPr>
+          <w:lang w:val="en-US"/>
+        </w:rPr>
+      </w:pPr>
+      <w:r>
+        <w:lastRenderedPageBreak/>
+        <w:t xml:space="preserve">In the </w:t>
+      </w:r>
+      <w:proofErr w:type="gramStart"/>
+      <w:r>
+        <w:t>tools</w:t>
+      </w:r>
+      <w:proofErr w:type="gramEnd"/>
+      <w:r>
+        <w:t xml:space="preserve"> menu, ensure the following settings are met</w:t>
+      </w:r>
+      <w:r>
+        <w:t>.  The settings may need to be changed using the subsequent option menus that appear.</w:t>
+      </w:r>
+    </w:p>
+    <w:p>
+      <w:pPr>
+        <w:pStyle w:val="ListParagraph"/>
+        <w:numPr>
+          <w:ilvl w:val="2"/>
+          <w:numId w:val="1"/>
+        </w:numPr>
+        <w:rPr>
+          <w:lang w:val="en-US"/>
+        </w:rPr>
+      </w:pPr>
+      <w:r>
+        <w:t xml:space="preserve">Board Part Number: </w:t>
+      </w:r>
+      <w:proofErr w:type="spellStart"/>
+      <w:r>
+        <w:t>BluiePill</w:t>
+      </w:r>
+      <w:proofErr w:type="spellEnd"/>
+      <w:r>
+        <w:t xml:space="preserve"> F103C8</w:t>
+      </w:r>
+    </w:p>
+    <w:p>
+      <w:pPr>
+        <w:jc w:val="center"/>
+        <w:rPr>
+          <w:lang w:val="en-US"/>
+        </w:rPr>
+      </w:pPr>
+      <w:r>
+        <w:rPr>
+          <w:lang w:val="en-US"/>
+        </w:rPr>
+        <w:drawing>
+          <wp:inline distT="0" distB="0" distL="0" distR="0" wp14:anchorId="2B29E4C2" wp14:editId="2D8C1BB3">
+            <wp:extent cx="3562350" cy="3115153"/>
+            <wp:effectExtent l="0" t="0" r="0" b="9525"/>
+            <wp:docPr id="251053944" name="Picture 1"/>
+            <wp:cNvGraphicFramePr>
+              <a:graphicFrameLocks xmlns:a="http://schemas.openxmlformats.org/drawingml/2006/main" noChangeAspect="1"/>
+            </wp:cNvGraphicFramePr>
+            <a:graphic xmlns:a="http://schemas.openxmlformats.org/drawingml/2006/main">
+              <a:graphicData uri="http://schemas.openxmlformats.org/drawingml/2006/picture">
+                <pic:pic xmlns:pic="http://schemas.openxmlformats.org/drawingml/2006/picture">
+                  <pic:nvPicPr>
+                    <pic:cNvPr id="251053944" name=""/>
+                    <pic:cNvPicPr/>
+                  </pic:nvPicPr>
+                  <pic:blipFill>
+                    <a:blip r:embed="rId22"/>
+                    <a:stretch>
+                      <a:fillRect/>
+                    </a:stretch>
+                  </pic:blipFill>
+                  <pic:spPr>
+                    <a:xfrm>
+                      <a:off x="0" y="0"/>
+                      <a:ext cx="3565590" cy="3117986"/>
+                    </a:xfrm>
+                    <a:prstGeom prst="rect">
+                      <a:avLst/>
+                    </a:prstGeom>
+                  </pic:spPr>
+                </pic:pic>
+              </a:graphicData>
+            </a:graphic>
+          </wp:inline>
+        </w:drawing>
+      </w:r>
+    </w:p>
+    <w:p>
+      <w:pPr>
+        <w:pStyle w:val="ListParagraph"/>
+        <w:numPr>
+          <w:ilvl w:val="2"/>
+          <w:numId w:val="1"/>
+        </w:numPr>
+        <w:rPr>
+          <w:lang w:val="en-US"/>
+        </w:rPr>
+      </w:pPr>
+      <w:r>
+        <w:t>U(S)ART Support: Enabled (generic “serial”)”</w:t>
+      </w:r>
+    </w:p>
+    <w:p>
+      <w:pPr>
+        <w:jc w:val="center"/>
+        <w:rPr>
+          <w:lang w:val="en-US"/>
+        </w:rPr>
+      </w:pPr>
+      <w:r>
+        <w:rPr>
+          <w:lang w:val="en-US"/>
+        </w:rPr>
+        <w:drawing>
+          <wp:inline distT="0" distB="0" distL="0" distR="0" wp14:anchorId="02E24DA3" wp14:editId="5A00EF7C">
+            <wp:extent cx="3905960" cy="3438525"/>
+            <wp:effectExtent l="0" t="0" r="0" b="0"/>
+            <wp:docPr id="1784587638" name="Picture 1"/>
+            <wp:cNvGraphicFramePr>
+              <a:graphicFrameLocks xmlns:a="http://schemas.openxmlformats.org/drawingml/2006/main" noChangeAspect="1"/>
+            </wp:cNvGraphicFramePr>
+            <a:graphic xmlns:a="http://schemas.openxmlformats.org/drawingml/2006/main">
+              <a:graphicData uri="http://schemas.openxmlformats.org/drawingml/2006/picture">
+                <pic:pic xmlns:pic="http://schemas.openxmlformats.org/drawingml/2006/picture">
+                  <pic:nvPicPr>
+                    <pic:cNvPr id="1784587638" name=""/>
+                    <pic:cNvPicPr/>
+                  </pic:nvPicPr>
+                  <pic:blipFill>
+                    <a:blip r:embed="rId23"/>
+                    <a:stretch>
+                      <a:fillRect/>
+                    </a:stretch>
+                  </pic:blipFill>
+                  <pic:spPr>
+                    <a:xfrm>
+                      <a:off x="0" y="0"/>
+                      <a:ext cx="3912532" cy="3444311"/>
+                    </a:xfrm>
+                    <a:prstGeom prst="rect">
+                      <a:avLst/>
+                    </a:prstGeom>
+                  </pic:spPr>
+                </pic:pic>
+              </a:graphicData>
+            </a:graphic>
+          </wp:inline>
+        </w:drawing>
+      </w:r>
+    </w:p>
+    <w:p>
+      <w:pPr>
+        <w:rPr>
+          <w:lang w:val="en-US"/>
+        </w:rPr>
+      </w:pPr>
+      <w:r>
+        <w:rPr>
+          <w:lang w:val="en-US"/>
+        </w:rPr>
+        <w:br w:type="page"/>
+      </w:r>
+    </w:p>
+    <w:p>
+      <w:pPr>
+        <w:pStyle w:val="ListParagraph"/>
+        <w:numPr>
+          <w:ilvl w:val="2"/>
+          <w:numId w:val="1"/>
+        </w:numPr>
+        <w:rPr>
+          <w:lang w:val="en-US"/>
+        </w:rPr>
+      </w:pPr>
+      <w:r>
+        <w:lastRenderedPageBreak/>
+        <w:t>USB Support (if available): CDC (generic ‘Serial’ supersede U(S)ART)”</w:t>
+      </w:r>
+    </w:p>
+    <w:p>
+      <w:pPr>
+        <w:jc w:val="center"/>
+        <w:rPr>
+          <w:lang w:val="en-US"/>
+        </w:rPr>
+      </w:pPr>
+      <w:r>
+        <w:rPr>
+          <w:lang w:val="en-US"/>
+        </w:rPr>
+        <w:drawing>
+          <wp:inline distT="0" distB="0" distL="0" distR="0" wp14:anchorId="3B4F93C9" wp14:editId="1F823B95">
+            <wp:extent cx="4502727" cy="3619500"/>
+            <wp:effectExtent l="0" t="0" r="0" b="0"/>
+            <wp:docPr id="223950880" name="Picture 1"/>
+            <wp:cNvGraphicFramePr>
+              <a:graphicFrameLocks xmlns:a="http://schemas.openxmlformats.org/drawingml/2006/main" noChangeAspect="1"/>
+            </wp:cNvGraphicFramePr>
+            <a:graphic xmlns:a="http://schemas.openxmlformats.org/drawingml/2006/main">
+              <a:graphicData uri="http://schemas.openxmlformats.org/drawingml/2006/picture">
+                <pic:pic xmlns:pic="http://schemas.openxmlformats.org/drawingml/2006/picture">
+                  <pic:nvPicPr>
+                    <pic:cNvPr id="223950880" name=""/>
+                    <pic:cNvPicPr/>
+                  </pic:nvPicPr>
+                  <pic:blipFill>
+                    <a:blip r:embed="rId24"/>
+                    <a:stretch>
+                      <a:fillRect/>
+                    </a:stretch>
+                  </pic:blipFill>
+                  <pic:spPr>
+                    <a:xfrm>
+                      <a:off x="0" y="0"/>
+                      <a:ext cx="4509126" cy="3624644"/>
+                    </a:xfrm>
+                    <a:prstGeom prst="rect">
+                      <a:avLst/>
+                    </a:prstGeom>
+                  </pic:spPr>
+                </pic:pic>
+              </a:graphicData>
+            </a:graphic>
+          </wp:inline>
+        </w:drawing>
+      </w:r>
+    </w:p>
+    <w:p>
+      <w:pPr>
+        <w:pStyle w:val="ListParagraph"/>
+        <w:numPr>
+          <w:ilvl w:val="2"/>
+          <w:numId w:val="1"/>
+        </w:numPr>
+        <w:rPr>
+          <w:lang w:val="en-US"/>
+        </w:rPr>
+      </w:pPr>
+      <w:r>
+        <w:t>Upload method: STM32</w:t>
+      </w:r>
+      <w:proofErr w:type="gramStart"/>
+      <w:r>
+        <w:t>CubeProgrammer(</w:t>
+      </w:r>
+      <w:proofErr w:type="gramEnd"/>
+      <w:r>
+        <w:t>SWD)</w:t>
+      </w:r>
+      <w:r>
+        <w:t>’</w:t>
+      </w:r>
+    </w:p>
+    <w:p>
+      <w:pPr>
+        <w:jc w:val="center"/>
+        <w:rPr>
+          <w:lang w:val="en-US"/>
+        </w:rPr>
+      </w:pPr>
+      <w:r>
+        <w:rPr>
+          <w:lang w:val="en-US"/>
+        </w:rPr>
+        <w:drawing>
+          <wp:inline distT="0" distB="0" distL="0" distR="0" wp14:anchorId="2C1BDA56" wp14:editId="4396CC38">
+            <wp:extent cx="4181475" cy="3788344"/>
+            <wp:effectExtent l="0" t="0" r="0" b="3175"/>
+            <wp:docPr id="1679233965" name="Picture 1"/>
+            <wp:cNvGraphicFramePr>
+              <a:graphicFrameLocks xmlns:a="http://schemas.openxmlformats.org/drawingml/2006/main" noChangeAspect="1"/>
+            </wp:cNvGraphicFramePr>
+            <a:graphic xmlns:a="http://schemas.openxmlformats.org/drawingml/2006/main">
+              <a:graphicData uri="http://schemas.openxmlformats.org/drawingml/2006/picture">
+                <pic:pic xmlns:pic="http://schemas.openxmlformats.org/drawingml/2006/picture">
+                  <pic:nvPicPr>
+                    <pic:cNvPr id="1679233965" name=""/>
+                    <pic:cNvPicPr/>
+                  </pic:nvPicPr>
+                  <pic:blipFill>
+                    <a:blip r:embed="rId25"/>
+                    <a:stretch>
+                      <a:fillRect/>
+                    </a:stretch>
+                  </pic:blipFill>
+                  <pic:spPr>
+                    <a:xfrm>
+                      <a:off x="0" y="0"/>
+                      <a:ext cx="4192541" cy="3798370"/>
+                    </a:xfrm>
+                    <a:prstGeom prst="rect">
+                      <a:avLst/>
+                    </a:prstGeom>
+                  </pic:spPr>
+                </pic:pic>
+              </a:graphicData>
+            </a:graphic>
+          </wp:inline>
+        </w:drawing>
+      </w:r>
+    </w:p>
+    <w:p>
+      <w:pPr>
+        <w:pStyle w:val="ListParagraph"/>
+        <w:numPr>
+          <w:ilvl w:val="1"/>
+          <w:numId w:val="1"/>
+        </w:numPr>
+        <w:rPr>
+          <w:lang w:val="en-US"/>
+        </w:rPr>
+      </w:pPr>
+      <w:r>
+        <w:lastRenderedPageBreak/>
+        <w:t>When complete, it should look like this</w:t>
+      </w:r>
+    </w:p>
+    <w:p>
+      <w:pPr>
+        <w:rPr>
+          <w:lang w:val="en-US"/>
+        </w:rPr>
+      </w:pPr>
+      <w:r>
+        <w:rPr>
+          <w:lang w:val="en-US"/>
+        </w:rPr>
+        <w:drawing>
+          <wp:inline distT="0" distB="0" distL="0" distR="0" wp14:anchorId="78AD54F5" wp14:editId="2CA1439A">
+            <wp:extent cx="5925377" cy="5449060"/>
+            <wp:effectExtent l="0" t="0" r="0" b="0"/>
+            <wp:docPr id="950329490" name="Picture 1"/>
+            <wp:cNvGraphicFramePr>
+              <a:graphicFrameLocks xmlns:a="http://schemas.openxmlformats.org/drawingml/2006/main" noChangeAspect="1"/>
+            </wp:cNvGraphicFramePr>
+            <a:graphic xmlns:a="http://schemas.openxmlformats.org/drawingml/2006/main">
+              <a:graphicData uri="http://schemas.openxmlformats.org/drawingml/2006/picture">
+                <pic:pic xmlns:pic="http://schemas.openxmlformats.org/drawingml/2006/picture">
+                  <pic:nvPicPr>
+                    <pic:cNvPr id="950329490" name=""/>
+                    <pic:cNvPicPr/>
+                  </pic:nvPicPr>
+                  <pic:blipFill>
+                    <a:blip r:embed="rId26"/>
+                    <a:stretch>
+                      <a:fillRect/>
+                    </a:stretch>
+                  </pic:blipFill>
+                  <pic:spPr>
+                    <a:xfrm>
+                      <a:off x="0" y="0"/>
+                      <a:ext cx="5925377" cy="5449060"/>
+                    </a:xfrm>
+                    <a:prstGeom prst="rect">
+                      <a:avLst/>
+                    </a:prstGeom>
+                  </pic:spPr>
+                </pic:pic>
+              </a:graphicData>
+            </a:graphic>
+          </wp:inline>
+        </w:drawing>
+      </w:r>
+    </w:p>
+    <w:p>
+      <w:pPr>
+        <w:rPr>
+          <w:lang w:val="en-US"/>
+        </w:rPr>
+      </w:pPr>
+    </w:p>
+    <w:p>
+      <w:pPr>
+        <w:rPr>
+          <w:lang w:val="en-US"/>
+        </w:rPr>
+      </w:pPr>
+    </w:p>
+    <w:p>
+      <w:pPr>
+        <w:rPr>
+          <w:lang w:val="en-US"/>
+        </w:rPr>
+      </w:pPr>
+    </w:p>
+    <w:p>
+      <w:pPr>
+        <w:rPr>
+          <w:lang w:val="en-US"/>
+        </w:rPr>
+      </w:pPr>
+    </w:p>
+    <w:p>
+      <w:pPr>
+        <w:rPr>
+          <w:lang w:val="en-US"/>
+        </w:rPr>
+      </w:pPr>
+    </w:p>
+    <w:p>
+      <w:pPr>
+        <w:rPr>
+          <w:lang w:val="en-US"/>
+        </w:rPr>
+      </w:pPr>
+    </w:p>
+    <w:p>
+      <w:pPr>
+        <w:rPr>
+          <w:lang w:val="en-US"/>
+        </w:rPr>
+      </w:pPr>
+    </w:p>
+    <w:p>
+      <w:pPr>
+        <w:rPr>
+          <w:lang w:val="en-US"/>
+        </w:rPr>
+      </w:pPr>
     </w:p>
     <w:p>
       <w:pPr>
@@ -204,120 +1662,60 @@
         </w:rPr>
       </w:pPr>
       <w:r>
-        <w:t>Once installation is done, go to Tools &gt; Board &gt; STM32 MCU Based Boards</w:t>
-      </w:r>
-    </w:p>
-    <w:p>
-      <w:pPr>
-        <w:pStyle w:val="ListParagraph"/>
-        <w:numPr>
-          <w:ilvl w:val="1"/>
-          <w:numId w:val="1"/>
-        </w:numPr>
-        <w:rPr>
-          <w:lang w:val="en-US"/>
-        </w:rPr>
-      </w:pPr>
-      <w:r>
-        <w:t>Select Generic STM32F1</w:t>
-      </w:r>
-    </w:p>
-    <w:p>
-      <w:pPr>
-        <w:pStyle w:val="ListParagraph"/>
-        <w:numPr>
-          <w:ilvl w:val="1"/>
-          <w:numId w:val="1"/>
-        </w:numPr>
-        <w:rPr>
-          <w:lang w:val="en-US"/>
-        </w:rPr>
-      </w:pPr>
-      <w:r>
-        <w:t>In the tools menu, ensure the following settings are met</w:t>
-      </w:r>
-    </w:p>
-    <w:p>
-      <w:pPr>
-        <w:pStyle w:val="ListParagraph"/>
-        <w:numPr>
-          <w:ilvl w:val="2"/>
-          <w:numId w:val="1"/>
-        </w:numPr>
-        <w:rPr>
-          <w:lang w:val="en-US"/>
-        </w:rPr>
-      </w:pPr>
-      <w:r>
-        <w:t xml:space="preserve">Board Part Number: </w:t>
-      </w:r>
-      <w:proofErr w:type="spellStart"/>
-      <w:r>
-        <w:t>BluiePill</w:t>
-      </w:r>
-      <w:proofErr w:type="spellEnd"/>
-      <w:r>
-        <w:t xml:space="preserve"> F103C8</w:t>
-      </w:r>
-    </w:p>
-    <w:p>
-      <w:pPr>
-        <w:pStyle w:val="ListParagraph"/>
-        <w:numPr>
-          <w:ilvl w:val="2"/>
-          <w:numId w:val="1"/>
-        </w:numPr>
-        <w:rPr>
-          <w:lang w:val="en-US"/>
-        </w:rPr>
-      </w:pPr>
-      <w:r>
-        <w:t>U(S)ART Support: Enabled (generic “serial”)”</w:t>
-      </w:r>
-    </w:p>
-    <w:p>
-      <w:pPr>
-        <w:pStyle w:val="ListParagraph"/>
-        <w:numPr>
-          <w:ilvl w:val="2"/>
-          <w:numId w:val="1"/>
-        </w:numPr>
-        <w:rPr>
-          <w:lang w:val="en-US"/>
-        </w:rPr>
-      </w:pPr>
-      <w:r>
-        <w:t>USB Support (if available): CDC (generic ‘Serial’ supersede U(S)ART)”</w:t>
-      </w:r>
-    </w:p>
-    <w:p>
-      <w:pPr>
-        <w:pStyle w:val="ListParagraph"/>
-        <w:numPr>
-          <w:ilvl w:val="2"/>
-          <w:numId w:val="1"/>
-        </w:numPr>
-        <w:rPr>
-          <w:lang w:val="en-US"/>
-        </w:rPr>
-      </w:pPr>
-      <w:r>
-        <w:t>Upload method: STM32CubeProgrammer(SWD)</w:t>
-      </w:r>
-    </w:p>
-    <w:p>
-      <w:pPr>
-        <w:pStyle w:val="ListParagraph"/>
-        <w:numPr>
-          <w:ilvl w:val="0"/>
-          <w:numId w:val="1"/>
-        </w:numPr>
-        <w:rPr>
-          <w:lang w:val="en-US"/>
-        </w:rPr>
-      </w:pPr>
-      <w:r>
         <w:t>Build with the checkmark</w:t>
+      </w:r>
+      <w:r>
+        <w:t xml:space="preserve"> in the top left corner.  When complete, you should see the following message at the bottom of the screen</w:t>
+      </w:r>
+      <w:r>
+        <w:t>.  The code should build accordingly and without errors.</w:t>
+      </w:r>
+    </w:p>
+    <w:p>
+      <w:pPr>
+        <w:rPr>
+          <w:lang w:val="en-US"/>
+        </w:rPr>
+      </w:pPr>
+      <w:r>
+        <w:rPr>
+          <w:lang w:val="en-US"/>
+        </w:rPr>
+        <w:drawing>
+          <wp:inline distT="0" distB="0" distL="0" distR="0" wp14:anchorId="6DB8D868" wp14:editId="7E698E19">
+            <wp:extent cx="5943600" cy="3342005"/>
+            <wp:effectExtent l="0" t="0" r="0" b="0"/>
+            <wp:docPr id="249340716" name="Picture 1"/>
+            <wp:cNvGraphicFramePr>
+              <a:graphicFrameLocks xmlns:a="http://schemas.openxmlformats.org/drawingml/2006/main" noChangeAspect="1"/>
+            </wp:cNvGraphicFramePr>
+            <a:graphic xmlns:a="http://schemas.openxmlformats.org/drawingml/2006/main">
+              <a:graphicData uri="http://schemas.openxmlformats.org/drawingml/2006/picture">
+                <pic:pic xmlns:pic="http://schemas.openxmlformats.org/drawingml/2006/picture">
+                  <pic:nvPicPr>
+                    <pic:cNvPr id="249340716" name=""/>
+                    <pic:cNvPicPr/>
+                  </pic:nvPicPr>
+                  <pic:blipFill>
+                    <a:blip r:embed="rId27"/>
+                    <a:stretch>
+                      <a:fillRect/>
+                    </a:stretch>
+                  </pic:blipFill>
+                  <pic:spPr>
+                    <a:xfrm>
+                      <a:off x="0" y="0"/>
+                      <a:ext cx="5943600" cy="3342005"/>
+                    </a:xfrm>
+                    <a:prstGeom prst="rect">
+                      <a:avLst/>
+                    </a:prstGeom>
+                  </pic:spPr>
+                </pic:pic>
+              </a:graphicData>
+            </a:graphic>
+          </wp:inline>
+        </w:drawing>
       </w:r>
     </w:p>
     <w:p>
@@ -371,17 +1769,121 @@
           <w:u w:val="single"/>
           <w:lang w:val="en-US"/>
         </w:rPr>
-        <w:t xml:space="preserve"> v2</w:t>
-      </w:r>
-    </w:p>
-    <w:p>
-      <w:pPr>
-        <w:rPr>
-          <w:lang w:val="en-US"/>
-        </w:rPr>
-      </w:pPr>
-      <w:r>
-        <w:rPr>
+        <w:t xml:space="preserve"> </w:t>
+      </w:r>
+      <w:r>
+        <w:rPr>
+          <w:u w:val="single"/>
+          <w:lang w:val="en-US"/>
+        </w:rPr>
+        <w:t>V</w:t>
+      </w:r>
+      <w:r>
+        <w:rPr>
+          <w:u w:val="single"/>
+          <w:lang w:val="en-US"/>
+        </w:rPr>
+        <w:t>2</w:t>
+      </w:r>
+    </w:p>
+    <w:p>
+      <w:pPr>
+        <w:rPr>
+          <w:lang w:val="en-US"/>
+        </w:rPr>
+      </w:pPr>
+      <w:r>
+        <w:rPr>
+          <w:lang w:val="en-US"/>
+        </w:rPr>
+        <w:t xml:space="preserve">John has already assembled a hardware kit.  You don’t need to disassemble </w:t>
+      </w:r>
+      <w:proofErr w:type="gramStart"/>
+      <w:r>
+        <w:rPr>
+          <w:lang w:val="en-US"/>
+        </w:rPr>
+        <w:t>it,</w:t>
+      </w:r>
+      <w:proofErr w:type="gramEnd"/>
+      <w:r>
+        <w:rPr>
+          <w:lang w:val="en-US"/>
+        </w:rPr>
+        <w:t xml:space="preserve"> you should just be able to plug the </w:t>
+      </w:r>
+      <w:proofErr w:type="spellStart"/>
+      <w:r>
+        <w:rPr>
+          <w:lang w:val="en-US"/>
+        </w:rPr>
+        <w:t>STLink</w:t>
+      </w:r>
+      <w:proofErr w:type="spellEnd"/>
+      <w:r>
+        <w:rPr>
+          <w:lang w:val="en-US"/>
+        </w:rPr>
+        <w:t xml:space="preserve"> V2 into your computer over USB</w:t>
+      </w:r>
+      <w:r>
+        <w:rPr>
+          <w:lang w:val="en-US"/>
+        </w:rPr>
+        <w:t>.  If any wires are disconnected, the following pinout can be used to reconnect the STLinkv2 to the Blue Pill.</w:t>
+      </w:r>
+    </w:p>
+    <w:p>
+      <w:pPr>
+        <w:rPr>
+          <w:lang w:val="en-US"/>
+        </w:rPr>
+      </w:pPr>
+    </w:p>
+    <w:p>
+      <w:pPr>
+        <w:rPr>
+          <w:b/>
+          <w:bCs/>
+          <w:lang w:val="en-US"/>
+        </w:rPr>
+      </w:pPr>
+      <w:r>
+        <w:rPr>
+          <w:b/>
+          <w:bCs/>
+          <w:lang w:val="en-US"/>
+        </w:rPr>
+        <w:t xml:space="preserve">The </w:t>
+      </w:r>
+      <w:proofErr w:type="spellStart"/>
+      <w:r>
+        <w:rPr>
+          <w:b/>
+          <w:bCs/>
+          <w:lang w:val="en-US"/>
+        </w:rPr>
+        <w:t>STLink</w:t>
+      </w:r>
+      <w:proofErr w:type="spellEnd"/>
+      <w:r>
+        <w:rPr>
+          <w:b/>
+          <w:bCs/>
+          <w:lang w:val="en-US"/>
+        </w:rPr>
+        <w:t xml:space="preserve"> V2 should only be connected to the computer when you are flashing the firmware.  At this time, the micro-USB cable for the Blue Pill should not be plugged in</w:t>
+      </w:r>
+    </w:p>
+    <w:p>
+      <w:pPr>
+        <w:rPr>
+          <w:lang w:val="en-US"/>
+        </w:rPr>
+      </w:pPr>
+      <w:r>
+        <w:rPr>
+          <w:noProof/>
           <w:lang w:val="en-US"/>
         </w:rPr>
         <w:drawing>
@@ -400,7 +1902,7 @@
                     <pic:cNvPicPr/>
                   </pic:nvPicPr>
                   <pic:blipFill>
-                    <a:blip r:embed="rId8"/>
+                    <a:blip r:embed="rId28"/>
                     <a:stretch>
                       <a:fillRect/>
                     </a:stretch>
@@ -436,7 +1938,13 @@
         <w:rPr>
           <w:lang w:val="en-US"/>
         </w:rPr>
-        <w:t>Follow this pinout</w:t>
+        <w:t xml:space="preserve">Connect the </w:t>
+      </w:r>
+      <w:r>
+        <w:rPr>
+          <w:lang w:val="en-US"/>
+        </w:rPr>
+        <w:t>STLinkV2 to a USB Port on your computer</w:t>
       </w:r>
     </w:p>
     <w:p>
@@ -454,83 +1962,12 @@
         <w:rPr>
           <w:lang w:val="en-US"/>
         </w:rPr>
-        <w:t>Click the arrow to upload</w:t>
-      </w:r>
-    </w:p>
-    <w:p>
-      <w:pPr>
-        <w:rPr>
-          <w:lang w:val="en-US"/>
-        </w:rPr>
-      </w:pPr>
-    </w:p>
-    <w:p>
-      <w:pPr>
-        <w:rPr>
-          <w:lang w:val="en-US"/>
-        </w:rPr>
-      </w:pPr>
-      <w:r>
-        <w:rPr>
-          <w:lang w:val="en-US"/>
-        </w:rPr>
-        <w:t xml:space="preserve">Unplug the </w:t>
-      </w:r>
-      <w:proofErr w:type="spellStart"/>
-      <w:r>
-        <w:rPr>
-          <w:lang w:val="en-US"/>
-        </w:rPr>
-        <w:t>STLink</w:t>
-      </w:r>
-      <w:proofErr w:type="spellEnd"/>
-      <w:r>
-        <w:rPr>
-          <w:lang w:val="en-US"/>
-        </w:rPr>
-        <w:t xml:space="preserve"> from the computer once this is done</w:t>
-      </w:r>
-    </w:p>
-    <w:p>
-      <w:pPr>
-        <w:rPr>
-          <w:lang w:val="en-US"/>
-        </w:rPr>
-      </w:pPr>
-    </w:p>
-    <w:p>
-      <w:pPr>
-        <w:rPr>
-          <w:u w:val="single"/>
-          <w:lang w:val="en-US"/>
-        </w:rPr>
-      </w:pPr>
-      <w:r>
-        <w:rPr>
-          <w:u w:val="single"/>
-          <w:lang w:val="en-US"/>
-        </w:rPr>
-        <w:br w:type="page"/>
-      </w:r>
-    </w:p>
-    <w:p>
-      <w:pPr>
-        <w:rPr>
-          <w:u w:val="single"/>
-          <w:lang w:val="en-US"/>
-        </w:rPr>
-      </w:pPr>
-      <w:r>
-        <w:rPr>
-          <w:u w:val="single"/>
-          <w:lang w:val="en-US"/>
-        </w:rPr>
-        <w:lastRenderedPageBreak/>
-        <w:t>Teros Testbench</w:t>
-      </w:r>
-    </w:p>
-    <w:p>
-      <w:pPr>
+        <w:t>Click the arrow to upload the code to the blue pill</w:t>
+      </w:r>
+    </w:p>
+    <w:p>
+      <w:pPr>
+        <w:jc w:val="center"/>
         <w:rPr>
           <w:lang w:val="en-US"/>
         </w:rPr>
@@ -540,10 +1977,10 @@
           <w:lang w:val="en-US"/>
         </w:rPr>
         <w:drawing>
-          <wp:inline distT="0" distB="0" distL="0" distR="0" wp14:anchorId="7CF08AFF" wp14:editId="122B8576">
-            <wp:extent cx="4812792" cy="7753350"/>
-            <wp:effectExtent l="0" t="0" r="6985" b="0"/>
-            <wp:docPr id="1490558324" name="Picture 1"/>
+          <wp:inline distT="0" distB="0" distL="0" distR="0" wp14:anchorId="1628FBE3" wp14:editId="52617578">
+            <wp:extent cx="4562475" cy="2565417"/>
+            <wp:effectExtent l="0" t="0" r="0" b="6350"/>
+            <wp:docPr id="1883987126" name="Picture 1"/>
             <wp:cNvGraphicFramePr>
               <a:graphicFrameLocks xmlns:a="http://schemas.openxmlformats.org/drawingml/2006/main" noChangeAspect="1"/>
             </wp:cNvGraphicFramePr>
@@ -551,32 +1988,23 @@
               <a:graphicData uri="http://schemas.openxmlformats.org/drawingml/2006/picture">
                 <pic:pic xmlns:pic="http://schemas.openxmlformats.org/drawingml/2006/picture">
                   <pic:nvPicPr>
-                    <pic:cNvPr id="1490558324" name=""/>
+                    <pic:cNvPr id="1883987126" name=""/>
                     <pic:cNvPicPr/>
                   </pic:nvPicPr>
-                  <pic:blipFill rotWithShape="1">
-                    <a:blip r:embed="rId9"/>
-                    <a:srcRect t="2778" b="1968"/>
+                  <pic:blipFill>
+                    <a:blip r:embed="rId29"/>
                     <a:stretch>
                       <a:fillRect/>
                     </a:stretch>
                   </pic:blipFill>
-                  <pic:spPr bwMode="auto">
+                  <pic:spPr>
                     <a:xfrm>
                       <a:off x="0" y="0"/>
-                      <a:ext cx="4818829" cy="7763076"/>
+                      <a:ext cx="4566192" cy="2567507"/>
                     </a:xfrm>
                     <a:prstGeom prst="rect">
                       <a:avLst/>
                     </a:prstGeom>
-                    <a:ln>
-                      <a:noFill/>
-                    </a:ln>
-                    <a:extLst>
-                      <a:ext uri="{53640926-AAD7-44D8-BBD7-CCE9431645EC}">
-                        <a14:shadowObscured xmlns:a14="http://schemas.microsoft.com/office/drawing/2010/main"/>
-                      </a:ext>
-                    </a:extLst>
                   </pic:spPr>
                 </pic:pic>
               </a:graphicData>
@@ -587,72 +2015,6 @@
     </w:p>
     <w:p>
       <w:pPr>
-        <w:rPr>
-          <w:lang w:val="en-US"/>
-        </w:rPr>
-      </w:pPr>
-    </w:p>
-    <w:p>
-      <w:pPr>
-        <w:rPr>
-          <w:lang w:val="en-US"/>
-        </w:rPr>
-      </w:pPr>
-      <w:r>
-        <w:rPr>
-          <w:lang w:val="en-US"/>
-        </w:rPr>
-        <w:t>Pay close attention to the wiring in the picture to get this hooked up.  Use a micro-USB cable to connect</w:t>
-      </w:r>
-      <w:r>
-        <w:rPr>
-          <w:lang w:val="en-US"/>
-        </w:rPr>
-        <w:t xml:space="preserve"> the blue pill to a computer</w:t>
-      </w:r>
-    </w:p>
-    <w:p>
-      <w:pPr>
-        <w:rPr>
-          <w:lang w:val="en-US"/>
-        </w:rPr>
-      </w:pPr>
-      <w:r>
-        <w:rPr>
-          <w:lang w:val="en-US"/>
-        </w:rPr>
-        <w:t>The blue pill will be on a breadboard</w:t>
-      </w:r>
-    </w:p>
-    <w:p>
-      <w:pPr>
-        <w:rPr>
-          <w:lang w:val="en-US"/>
-        </w:rPr>
-      </w:pPr>
-    </w:p>
-    <w:p>
-      <w:pPr>
-        <w:rPr>
-          <w:lang w:val="en-US"/>
-        </w:rPr>
-      </w:pPr>
-      <w:r>
-        <w:rPr>
-          <w:lang w:val="en-US"/>
-        </w:rPr>
-        <w:t>As soon as the code is flashed with the arrow the program will launch.  To view output…</w:t>
-      </w:r>
-    </w:p>
-    <w:p>
-      <w:pPr>
-        <w:rPr>
-          <w:lang w:val="en-US"/>
-        </w:rPr>
-      </w:pPr>
-    </w:p>
-    <w:p>
-      <w:pPr>
         <w:pStyle w:val="ListParagraph"/>
         <w:numPr>
           <w:ilvl w:val="0"/>
@@ -666,7 +2028,8 @@
         <w:rPr>
           <w:lang w:val="en-US"/>
         </w:rPr>
-        <w:t>Tools &gt; Serial Monitor</w:t>
+        <w:lastRenderedPageBreak/>
+        <w:t>You should see a message in the bottom right corner or in the terminal stating that code flashing has been completed.</w:t>
       </w:r>
     </w:p>
     <w:p>
@@ -677,26 +2040,6 @@
           <w:numId w:val="1"/>
         </w:numPr>
         <w:rPr>
-          <w:lang w:val="en-US"/>
-        </w:rPr>
-      </w:pPr>
-      <w:r>
-        <w:rPr>
-          <w:lang w:val="en-US"/>
-        </w:rPr>
-        <w:t>Change the Baud Rate to 115200</w:t>
-      </w:r>
-    </w:p>
-    <w:p>
-      <w:pPr>
-        <w:rPr>
-          <w:lang w:val="en-US"/>
-        </w:rPr>
-      </w:pPr>
-    </w:p>
-    <w:p>
-      <w:pPr>
-        <w:rPr>
           <w:b/>
           <w:bCs/>
           <w:lang w:val="en-US"/>
@@ -708,7 +2051,1120 @@
           <w:bCs/>
           <w:lang w:val="en-US"/>
         </w:rPr>
-        <w:t>To get data, unplug the TEROS from the VCC 5V only and plug it back in.  Do this each time you want to generate a new data point (no faster than once every 0.5 seconds)</w:t>
+        <w:t xml:space="preserve">Unplug the </w:t>
+      </w:r>
+      <w:proofErr w:type="spellStart"/>
+      <w:r>
+        <w:rPr>
+          <w:b/>
+          <w:bCs/>
+          <w:lang w:val="en-US"/>
+        </w:rPr>
+        <w:t>STLink</w:t>
+      </w:r>
+      <w:proofErr w:type="spellEnd"/>
+      <w:r>
+        <w:rPr>
+          <w:b/>
+          <w:bCs/>
+          <w:lang w:val="en-US"/>
+        </w:rPr>
+        <w:t xml:space="preserve"> from the computer once this is done</w:t>
+      </w:r>
+      <w:r>
+        <w:rPr>
+          <w:b/>
+          <w:bCs/>
+          <w:lang w:val="en-US"/>
+        </w:rPr>
+        <w:t xml:space="preserve"> and the code has flashed successfully.</w:t>
+      </w:r>
+    </w:p>
+    <w:p>
+      <w:pPr>
+        <w:rPr>
+          <w:b/>
+          <w:bCs/>
+          <w:lang w:val="en-US"/>
+        </w:rPr>
+      </w:pPr>
+    </w:p>
+    <w:p>
+      <w:pPr>
+        <w:rPr>
+          <w:b/>
+          <w:bCs/>
+          <w:lang w:val="en-US"/>
+        </w:rPr>
+      </w:pPr>
+    </w:p>
+    <w:p>
+      <w:pPr>
+        <w:rPr>
+          <w:lang w:val="en-US"/>
+        </w:rPr>
+      </w:pPr>
+    </w:p>
+    <w:p>
+      <w:pPr>
+        <w:rPr>
+          <w:u w:val="single"/>
+          <w:lang w:val="en-US"/>
+        </w:rPr>
+      </w:pPr>
+      <w:r>
+        <w:rPr>
+          <w:u w:val="single"/>
+          <w:lang w:val="en-US"/>
+        </w:rPr>
+        <w:br w:type="page"/>
+      </w:r>
+    </w:p>
+    <w:p>
+      <w:pPr>
+        <w:rPr>
+          <w:u w:val="single"/>
+          <w:lang w:val="en-US"/>
+        </w:rPr>
+      </w:pPr>
+      <w:r>
+        <w:rPr>
+          <w:u w:val="single"/>
+          <w:lang w:val="en-US"/>
+        </w:rPr>
+        <w:lastRenderedPageBreak/>
+        <w:t>Teros Testbench</w:t>
+      </w:r>
+    </w:p>
+    <w:p>
+      <w:pPr>
+        <w:rPr>
+          <w:lang w:val="en-US"/>
+        </w:rPr>
+      </w:pPr>
+      <w:r>
+        <w:rPr>
+          <w:lang w:val="en-US"/>
+        </w:rPr>
+        <w:t>Below is a rough diagram of the TEROS testbench.  John has already attached wires to different parts of the Blue Pill</w:t>
+      </w:r>
+      <w:r>
+        <w:rPr>
+          <w:lang w:val="en-US"/>
+        </w:rPr>
+        <w:t xml:space="preserve"> – however, please validate that they are in the correct place.  </w:t>
+      </w:r>
+      <w:r>
+        <w:rPr>
+          <w:b/>
+          <w:bCs/>
+          <w:lang w:val="en-US"/>
+        </w:rPr>
+        <w:t>It is very likely that the limit switch is in the incorrect spot</w:t>
+      </w:r>
+      <w:r>
+        <w:rPr>
+          <w:lang w:val="en-US"/>
+        </w:rPr>
+        <w:t>.  To connect the TEROS, plug the wires from the TEROS12 into the wires plugged into the following ports on the Blue Pill.</w:t>
+      </w:r>
+      <w:r>
+        <w:rPr>
+          <w:lang w:val="en-US"/>
+        </w:rPr>
+        <w:t xml:space="preserve">  </w:t>
+      </w:r>
+      <w:r>
+        <w:rPr>
+          <w:b/>
+          <w:bCs/>
+          <w:lang w:val="en-US"/>
+        </w:rPr>
+        <w:t>The top of the blue pill has all ports labelled on the left and right side.</w:t>
+      </w:r>
+    </w:p>
+    <w:tbl>
+      <w:tblPr>
+        <w:tblStyle w:val="TableGrid"/>
+        <w:tblW w:w="0" w:type="auto"/>
+        <w:tblLook w:val="04A0" w:firstRow="1" w:lastRow="0" w:firstColumn="1" w:lastColumn="0" w:noHBand="0" w:noVBand="1"/>
+      </w:tblPr>
+      <w:tblGrid>
+        <w:gridCol w:w="3116"/>
+        <w:gridCol w:w="3117"/>
+        <w:gridCol w:w="3117"/>
+      </w:tblGrid>
+      <w:tr>
+        <w:tc>
+          <w:tcPr>
+            <w:tcW w:w="3116" w:type="dxa"/>
+          </w:tcPr>
+          <w:p>
+            <w:pPr>
+              <w:jc w:val="center"/>
+              <w:rPr>
+                <w:lang w:val="en-US"/>
+              </w:rPr>
+            </w:pPr>
+            <w:r>
+              <w:rPr>
+                <w:lang w:val="en-US"/>
+              </w:rPr>
+              <w:t>Teros Wire</w:t>
+            </w:r>
+          </w:p>
+        </w:tc>
+        <w:tc>
+          <w:tcPr>
+            <w:tcW w:w="3117" w:type="dxa"/>
+          </w:tcPr>
+          <w:p>
+            <w:pPr>
+              <w:jc w:val="center"/>
+              <w:rPr>
+                <w:lang w:val="en-US"/>
+              </w:rPr>
+            </w:pPr>
+            <w:r>
+              <w:rPr>
+                <w:lang w:val="en-US"/>
+              </w:rPr>
+              <w:t>Blue Pill Port</w:t>
+            </w:r>
+          </w:p>
+        </w:tc>
+        <w:tc>
+          <w:tcPr>
+            <w:tcW w:w="3117" w:type="dxa"/>
+          </w:tcPr>
+          <w:p>
+            <w:pPr>
+              <w:jc w:val="center"/>
+              <w:rPr>
+                <w:lang w:val="en-US"/>
+              </w:rPr>
+            </w:pPr>
+            <w:r>
+              <w:rPr>
+                <w:lang w:val="en-US"/>
+              </w:rPr>
+              <w:t>Notes</w:t>
+            </w:r>
+          </w:p>
+        </w:tc>
+      </w:tr>
+      <w:tr>
+        <w:tc>
+          <w:tcPr>
+            <w:tcW w:w="3116" w:type="dxa"/>
+          </w:tcPr>
+          <w:p>
+            <w:pPr>
+              <w:jc w:val="center"/>
+              <w:rPr>
+                <w:lang w:val="en-US"/>
+              </w:rPr>
+            </w:pPr>
+            <w:r>
+              <w:rPr>
+                <w:lang w:val="en-US"/>
+              </w:rPr>
+              <w:t>Brown</w:t>
+            </w:r>
+          </w:p>
+        </w:tc>
+        <w:tc>
+          <w:tcPr>
+            <w:tcW w:w="3117" w:type="dxa"/>
+          </w:tcPr>
+          <w:p>
+            <w:pPr>
+              <w:jc w:val="center"/>
+              <w:rPr>
+                <w:lang w:val="en-US"/>
+              </w:rPr>
+            </w:pPr>
+            <w:r>
+              <w:rPr>
+                <w:lang w:val="en-US"/>
+              </w:rPr>
+              <w:t>5V</w:t>
+            </w:r>
+          </w:p>
+        </w:tc>
+        <w:tc>
+          <w:tcPr>
+            <w:tcW w:w="3117" w:type="dxa"/>
+          </w:tcPr>
+          <w:p>
+            <w:pPr>
+              <w:jc w:val="center"/>
+              <w:rPr>
+                <w:b/>
+                <w:bCs/>
+                <w:lang w:val="en-US"/>
+              </w:rPr>
+            </w:pPr>
+            <w:r>
+              <w:rPr>
+                <w:b/>
+                <w:bCs/>
+                <w:lang w:val="en-US"/>
+              </w:rPr>
+              <w:t>Connect to the opposite end of the limit switch</w:t>
+            </w:r>
+          </w:p>
+        </w:tc>
+      </w:tr>
+      <w:tr>
+        <w:tc>
+          <w:tcPr>
+            <w:tcW w:w="3116" w:type="dxa"/>
+          </w:tcPr>
+          <w:p>
+            <w:pPr>
+              <w:jc w:val="center"/>
+              <w:rPr>
+                <w:lang w:val="en-US"/>
+              </w:rPr>
+            </w:pPr>
+            <w:r>
+              <w:rPr>
+                <w:lang w:val="en-US"/>
+              </w:rPr>
+              <w:t>Grey</w:t>
+            </w:r>
+          </w:p>
+        </w:tc>
+        <w:tc>
+          <w:tcPr>
+            <w:tcW w:w="3117" w:type="dxa"/>
+          </w:tcPr>
+          <w:p>
+            <w:pPr>
+              <w:jc w:val="center"/>
+              <w:rPr>
+                <w:lang w:val="en-US"/>
+              </w:rPr>
+            </w:pPr>
+            <w:r>
+              <w:rPr>
+                <w:lang w:val="en-US"/>
+              </w:rPr>
+              <w:t>GND</w:t>
+            </w:r>
+          </w:p>
+        </w:tc>
+        <w:tc>
+          <w:tcPr>
+            <w:tcW w:w="3117" w:type="dxa"/>
+          </w:tcPr>
+          <w:p>
+            <w:pPr>
+              <w:jc w:val="center"/>
+              <w:rPr>
+                <w:lang w:val="en-US"/>
+              </w:rPr>
+            </w:pPr>
+            <w:r>
+              <w:rPr>
+                <w:lang w:val="en-US"/>
+              </w:rPr>
+              <w:t>Any GND port will work – use the one that John already plugged a wire into</w:t>
+            </w:r>
+          </w:p>
+        </w:tc>
+      </w:tr>
+      <w:tr>
+        <w:tc>
+          <w:tcPr>
+            <w:tcW w:w="3116" w:type="dxa"/>
+          </w:tcPr>
+          <w:p>
+            <w:pPr>
+              <w:jc w:val="center"/>
+              <w:rPr>
+                <w:lang w:val="en-US"/>
+              </w:rPr>
+            </w:pPr>
+            <w:r>
+              <w:rPr>
+                <w:lang w:val="en-US"/>
+              </w:rPr>
+              <w:t>Orange</w:t>
+            </w:r>
+          </w:p>
+        </w:tc>
+        <w:tc>
+          <w:tcPr>
+            <w:tcW w:w="3117" w:type="dxa"/>
+          </w:tcPr>
+          <w:p>
+            <w:pPr>
+              <w:jc w:val="center"/>
+              <w:rPr>
+                <w:b/>
+                <w:bCs/>
+                <w:lang w:val="en-US"/>
+              </w:rPr>
+            </w:pPr>
+            <w:r>
+              <w:rPr>
+                <w:b/>
+                <w:bCs/>
+                <w:lang w:val="en-US"/>
+              </w:rPr>
+              <w:t>A3</w:t>
+            </w:r>
+          </w:p>
+        </w:tc>
+        <w:tc>
+          <w:tcPr>
+            <w:tcW w:w="3117" w:type="dxa"/>
+          </w:tcPr>
+          <w:p>
+            <w:pPr>
+              <w:jc w:val="center"/>
+              <w:rPr>
+                <w:lang w:val="en-US"/>
+              </w:rPr>
+            </w:pPr>
+          </w:p>
+        </w:tc>
+      </w:tr>
+    </w:tbl>
+    <w:p>
+      <w:pPr>
+        <w:rPr>
+          <w:lang w:val="en-US"/>
+        </w:rPr>
+      </w:pPr>
+    </w:p>
+    <w:p>
+      <w:pPr>
+        <w:rPr>
+          <w:b/>
+          <w:bCs/>
+          <w:lang w:val="en-US"/>
+        </w:rPr>
+      </w:pPr>
+      <w:r>
+        <w:rPr>
+          <w:b/>
+          <w:bCs/>
+          <w:lang w:val="en-US"/>
+        </w:rPr>
+        <w:t xml:space="preserve">You can leave the </w:t>
+      </w:r>
+      <w:proofErr w:type="spellStart"/>
+      <w:r>
+        <w:rPr>
+          <w:b/>
+          <w:bCs/>
+          <w:lang w:val="en-US"/>
+        </w:rPr>
+        <w:t>STLink</w:t>
+      </w:r>
+      <w:proofErr w:type="spellEnd"/>
+      <w:r>
+        <w:rPr>
+          <w:b/>
+          <w:bCs/>
+          <w:lang w:val="en-US"/>
+        </w:rPr>
+        <w:t xml:space="preserve"> V2 plugged into the Blue Pill, but do not plug it to the computer after the code is flashed!  Ensure it is unplugged before plugging the Blue Pill in</w:t>
+      </w:r>
+      <w:r>
+        <w:rPr>
+          <w:b/>
+          <w:bCs/>
+          <w:lang w:val="en-US"/>
+        </w:rPr>
+        <w:t xml:space="preserve">!  </w:t>
+      </w:r>
+    </w:p>
+    <w:p>
+      <w:pPr>
+        <w:rPr>
+          <w:b/>
+          <w:bCs/>
+          <w:lang w:val="en-US"/>
+        </w:rPr>
+      </w:pPr>
+    </w:p>
+    <w:p>
+      <w:pPr>
+        <w:rPr>
+          <w:lang w:val="en-US"/>
+        </w:rPr>
+      </w:pPr>
+      <w:r>
+        <w:rPr>
+          <w:lang w:val="en-US"/>
+        </w:rPr>
+        <w:t xml:space="preserve">Diagram of the setup (I’ve tried my best to map the wire </w:t>
+      </w:r>
+      <w:proofErr w:type="spellStart"/>
+      <w:r>
+        <w:rPr>
+          <w:lang w:val="en-US"/>
+        </w:rPr>
+        <w:t>colours</w:t>
+      </w:r>
+      <w:proofErr w:type="spellEnd"/>
+      <w:r>
+        <w:rPr>
+          <w:lang w:val="en-US"/>
+        </w:rPr>
+        <w:t>, however they may vary)</w:t>
+      </w:r>
+    </w:p>
+    <w:p>
+      <w:pPr>
+        <w:rPr>
+          <w:lang w:val="en-US"/>
+        </w:rPr>
+      </w:pPr>
+      <w:r>
+        <w:rPr>
+          <w:lang w:val="en-US"/>
+        </w:rPr>
+        <w:drawing>
+          <wp:inline distT="0" distB="0" distL="0" distR="0" wp14:anchorId="7B70FF6C" wp14:editId="26236B14">
+            <wp:extent cx="5943600" cy="3180080"/>
+            <wp:effectExtent l="0" t="0" r="0" b="1270"/>
+            <wp:docPr id="257096927" name="Picture 1"/>
+            <wp:cNvGraphicFramePr>
+              <a:graphicFrameLocks xmlns:a="http://schemas.openxmlformats.org/drawingml/2006/main" noChangeAspect="1"/>
+            </wp:cNvGraphicFramePr>
+            <a:graphic xmlns:a="http://schemas.openxmlformats.org/drawingml/2006/main">
+              <a:graphicData uri="http://schemas.openxmlformats.org/drawingml/2006/picture">
+                <pic:pic xmlns:pic="http://schemas.openxmlformats.org/drawingml/2006/picture">
+                  <pic:nvPicPr>
+                    <pic:cNvPr id="257096927" name=""/>
+                    <pic:cNvPicPr/>
+                  </pic:nvPicPr>
+                  <pic:blipFill>
+                    <a:blip r:embed="rId30"/>
+                    <a:stretch>
+                      <a:fillRect/>
+                    </a:stretch>
+                  </pic:blipFill>
+                  <pic:spPr>
+                    <a:xfrm>
+                      <a:off x="0" y="0"/>
+                      <a:ext cx="5943600" cy="3180080"/>
+                    </a:xfrm>
+                    <a:prstGeom prst="rect">
+                      <a:avLst/>
+                    </a:prstGeom>
+                  </pic:spPr>
+                </pic:pic>
+              </a:graphicData>
+            </a:graphic>
+          </wp:inline>
+        </w:drawing>
+      </w:r>
+    </w:p>
+    <w:p>
+      <w:pPr>
+        <w:rPr>
+          <w:lang w:val="en-US"/>
+        </w:rPr>
+      </w:pPr>
+    </w:p>
+    <w:p>
+      <w:pPr>
+        <w:rPr>
+          <w:u w:val="single"/>
+          <w:lang w:val="en-US"/>
+        </w:rPr>
+      </w:pPr>
+      <w:r>
+        <w:rPr>
+          <w:u w:val="single"/>
+          <w:lang w:val="en-US"/>
+        </w:rPr>
+        <w:lastRenderedPageBreak/>
+        <w:t xml:space="preserve">Viewing Data Output from </w:t>
+      </w:r>
+      <w:proofErr w:type="gramStart"/>
+      <w:r>
+        <w:rPr>
+          <w:u w:val="single"/>
+          <w:lang w:val="en-US"/>
+        </w:rPr>
+        <w:t>the TEROS12</w:t>
+      </w:r>
+      <w:proofErr w:type="gramEnd"/>
+    </w:p>
+    <w:p>
+      <w:pPr>
+        <w:pStyle w:val="ListParagraph"/>
+        <w:numPr>
+          <w:ilvl w:val="0"/>
+          <w:numId w:val="1"/>
+        </w:numPr>
+        <w:rPr>
+          <w:lang w:val="en-US"/>
+        </w:rPr>
+      </w:pPr>
+      <w:r>
+        <w:rPr>
+          <w:lang w:val="en-US"/>
+        </w:rPr>
+        <w:t>Plug the Blue Pill into your computer via the attached USB cable (</w:t>
+      </w:r>
+      <w:r>
+        <w:rPr>
+          <w:b/>
+          <w:bCs/>
+          <w:lang w:val="en-US"/>
+        </w:rPr>
+        <w:t xml:space="preserve">not </w:t>
+      </w:r>
+      <w:r>
+        <w:rPr>
+          <w:lang w:val="en-US"/>
+        </w:rPr>
+        <w:t xml:space="preserve">using the </w:t>
+      </w:r>
+      <w:proofErr w:type="spellStart"/>
+      <w:r>
+        <w:rPr>
+          <w:lang w:val="en-US"/>
+        </w:rPr>
+        <w:t>STLink</w:t>
+      </w:r>
+      <w:proofErr w:type="spellEnd"/>
+      <w:r>
+        <w:rPr>
+          <w:lang w:val="en-US"/>
+        </w:rPr>
+        <w:t xml:space="preserve"> v2)</w:t>
+      </w:r>
+    </w:p>
+    <w:p>
+      <w:pPr>
+        <w:pStyle w:val="ListParagraph"/>
+        <w:numPr>
+          <w:ilvl w:val="0"/>
+          <w:numId w:val="1"/>
+        </w:numPr>
+        <w:rPr>
+          <w:lang w:val="en-US"/>
+        </w:rPr>
+      </w:pPr>
+      <w:r>
+        <w:rPr>
+          <w:lang w:val="en-US"/>
+        </w:rPr>
+        <w:t xml:space="preserve">In Arduino IDE, navigate to </w:t>
+      </w:r>
+      <w:r>
+        <w:rPr>
+          <w:lang w:val="en-US"/>
+        </w:rPr>
+        <w:t>Tools &gt; Serial Monitor</w:t>
+      </w:r>
+    </w:p>
+    <w:p>
+      <w:pPr>
+        <w:rPr>
+          <w:lang w:val="en-US"/>
+        </w:rPr>
+      </w:pPr>
+      <w:r>
+        <w:rPr>
+          <w:lang w:val="en-US"/>
+        </w:rPr>
+        <w:drawing>
+          <wp:inline distT="0" distB="0" distL="0" distR="0" wp14:anchorId="69E758F2" wp14:editId="6B4C2D6E">
+            <wp:extent cx="5896798" cy="5325218"/>
+            <wp:effectExtent l="0" t="0" r="8890" b="8890"/>
+            <wp:docPr id="1520037299" name="Picture 1"/>
+            <wp:cNvGraphicFramePr>
+              <a:graphicFrameLocks xmlns:a="http://schemas.openxmlformats.org/drawingml/2006/main" noChangeAspect="1"/>
+            </wp:cNvGraphicFramePr>
+            <a:graphic xmlns:a="http://schemas.openxmlformats.org/drawingml/2006/main">
+              <a:graphicData uri="http://schemas.openxmlformats.org/drawingml/2006/picture">
+                <pic:pic xmlns:pic="http://schemas.openxmlformats.org/drawingml/2006/picture">
+                  <pic:nvPicPr>
+                    <pic:cNvPr id="1520037299" name=""/>
+                    <pic:cNvPicPr/>
+                  </pic:nvPicPr>
+                  <pic:blipFill>
+                    <a:blip r:embed="rId31"/>
+                    <a:stretch>
+                      <a:fillRect/>
+                    </a:stretch>
+                  </pic:blipFill>
+                  <pic:spPr>
+                    <a:xfrm>
+                      <a:off x="0" y="0"/>
+                      <a:ext cx="5896798" cy="5325218"/>
+                    </a:xfrm>
+                    <a:prstGeom prst="rect">
+                      <a:avLst/>
+                    </a:prstGeom>
+                  </pic:spPr>
+                </pic:pic>
+              </a:graphicData>
+            </a:graphic>
+          </wp:inline>
+        </w:drawing>
+      </w:r>
+    </w:p>
+    <w:p>
+      <w:pPr>
+        <w:rPr>
+          <w:lang w:val="en-US"/>
+        </w:rPr>
+      </w:pPr>
+    </w:p>
+    <w:p>
+      <w:pPr>
+        <w:rPr>
+          <w:lang w:val="en-US"/>
+        </w:rPr>
+      </w:pPr>
+      <w:r>
+        <w:rPr>
+          <w:lang w:val="en-US"/>
+        </w:rPr>
+        <w:br w:type="page"/>
+      </w:r>
+    </w:p>
+    <w:p>
+      <w:pPr>
+        <w:pStyle w:val="ListParagraph"/>
+        <w:numPr>
+          <w:ilvl w:val="0"/>
+          <w:numId w:val="1"/>
+        </w:numPr>
+        <w:rPr>
+          <w:lang w:val="en-US"/>
+        </w:rPr>
+      </w:pPr>
+      <w:r>
+        <w:rPr>
+          <w:lang w:val="en-US"/>
+        </w:rPr>
+        <w:lastRenderedPageBreak/>
+        <w:t>The serial monitor will open at the bottom of the interface.</w:t>
+      </w:r>
+    </w:p>
+    <w:p>
+      <w:pPr>
+        <w:rPr>
+          <w:lang w:val="en-US"/>
+        </w:rPr>
+      </w:pPr>
+      <w:r>
+        <w:rPr>
+          <w:lang w:val="en-US"/>
+        </w:rPr>
+        <w:drawing>
+          <wp:inline distT="0" distB="0" distL="0" distR="0" wp14:anchorId="6366A8C5" wp14:editId="7A8966B4">
+            <wp:extent cx="5943600" cy="3336925"/>
+            <wp:effectExtent l="0" t="0" r="0" b="0"/>
+            <wp:docPr id="1453309655" name="Picture 1"/>
+            <wp:cNvGraphicFramePr>
+              <a:graphicFrameLocks xmlns:a="http://schemas.openxmlformats.org/drawingml/2006/main" noChangeAspect="1"/>
+            </wp:cNvGraphicFramePr>
+            <a:graphic xmlns:a="http://schemas.openxmlformats.org/drawingml/2006/main">
+              <a:graphicData uri="http://schemas.openxmlformats.org/drawingml/2006/picture">
+                <pic:pic xmlns:pic="http://schemas.openxmlformats.org/drawingml/2006/picture">
+                  <pic:nvPicPr>
+                    <pic:cNvPr id="1453309655" name=""/>
+                    <pic:cNvPicPr/>
+                  </pic:nvPicPr>
+                  <pic:blipFill>
+                    <a:blip r:embed="rId32"/>
+                    <a:stretch>
+                      <a:fillRect/>
+                    </a:stretch>
+                  </pic:blipFill>
+                  <pic:spPr>
+                    <a:xfrm>
+                      <a:off x="0" y="0"/>
+                      <a:ext cx="5943600" cy="3336925"/>
+                    </a:xfrm>
+                    <a:prstGeom prst="rect">
+                      <a:avLst/>
+                    </a:prstGeom>
+                  </pic:spPr>
+                </pic:pic>
+              </a:graphicData>
+            </a:graphic>
+          </wp:inline>
+        </w:drawing>
+      </w:r>
+    </w:p>
+    <w:p>
+      <w:pPr>
+        <w:pStyle w:val="ListParagraph"/>
+        <w:numPr>
+          <w:ilvl w:val="0"/>
+          <w:numId w:val="1"/>
+        </w:numPr>
+        <w:rPr>
+          <w:lang w:val="en-US"/>
+        </w:rPr>
+      </w:pPr>
+      <w:r>
+        <w:rPr>
+          <w:lang w:val="en-US"/>
+        </w:rPr>
+        <w:t xml:space="preserve">In the top right corner of the Serial </w:t>
+      </w:r>
+      <w:proofErr w:type="spellStart"/>
+      <w:r>
+        <w:rPr>
+          <w:lang w:val="en-US"/>
+        </w:rPr>
+        <w:t>Montior</w:t>
+      </w:r>
+      <w:proofErr w:type="spellEnd"/>
+      <w:r>
+        <w:rPr>
+          <w:lang w:val="en-US"/>
+        </w:rPr>
+        <w:t xml:space="preserve">, you will see something that says “9600 baud”.  Open this and change the baud rate to </w:t>
+      </w:r>
+      <w:r>
+        <w:rPr>
+          <w:b/>
+          <w:bCs/>
+          <w:lang w:val="en-US"/>
+        </w:rPr>
+        <w:t>115200</w:t>
+      </w:r>
+      <w:r>
+        <w:rPr>
+          <w:lang w:val="en-US"/>
+        </w:rPr>
+        <w:t>.</w:t>
+      </w:r>
+    </w:p>
+    <w:p>
+      <w:pPr>
+        <w:pStyle w:val="ListParagraph"/>
+        <w:numPr>
+          <w:ilvl w:val="1"/>
+          <w:numId w:val="1"/>
+        </w:numPr>
+        <w:rPr>
+          <w:lang w:val="en-US"/>
+        </w:rPr>
+      </w:pPr>
+      <w:r>
+        <w:rPr>
+          <w:lang w:val="en-US"/>
+        </w:rPr>
+        <w:t>You may have to scroll to find the correct baud rate.</w:t>
+      </w:r>
+    </w:p>
+    <w:p>
+      <w:pPr>
+        <w:rPr>
+          <w:lang w:val="en-US"/>
+        </w:rPr>
+      </w:pPr>
+      <w:r>
+        <w:rPr>
+          <w:lang w:val="en-US"/>
+        </w:rPr>
+        <w:drawing>
+          <wp:inline distT="0" distB="0" distL="0" distR="0" wp14:anchorId="16483F79" wp14:editId="5B229AAD">
+            <wp:extent cx="5943600" cy="849630"/>
+            <wp:effectExtent l="0" t="0" r="0" b="7620"/>
+            <wp:docPr id="565421824" name="Picture 1"/>
+            <wp:cNvGraphicFramePr>
+              <a:graphicFrameLocks xmlns:a="http://schemas.openxmlformats.org/drawingml/2006/main" noChangeAspect="1"/>
+            </wp:cNvGraphicFramePr>
+            <a:graphic xmlns:a="http://schemas.openxmlformats.org/drawingml/2006/main">
+              <a:graphicData uri="http://schemas.openxmlformats.org/drawingml/2006/picture">
+                <pic:pic xmlns:pic="http://schemas.openxmlformats.org/drawingml/2006/picture">
+                  <pic:nvPicPr>
+                    <pic:cNvPr id="565421824" name=""/>
+                    <pic:cNvPicPr/>
+                  </pic:nvPicPr>
+                  <pic:blipFill>
+                    <a:blip r:embed="rId33"/>
+                    <a:stretch>
+                      <a:fillRect/>
+                    </a:stretch>
+                  </pic:blipFill>
+                  <pic:spPr>
+                    <a:xfrm>
+                      <a:off x="0" y="0"/>
+                      <a:ext cx="5943600" cy="849630"/>
+                    </a:xfrm>
+                    <a:prstGeom prst="rect">
+                      <a:avLst/>
+                    </a:prstGeom>
+                  </pic:spPr>
+                </pic:pic>
+              </a:graphicData>
+            </a:graphic>
+          </wp:inline>
+        </w:drawing>
+      </w:r>
+    </w:p>
+    <w:p>
+      <w:pPr>
+        <w:rPr>
+          <w:i/>
+          <w:iCs/>
+          <w:lang w:val="en-US"/>
+        </w:rPr>
+      </w:pPr>
+      <w:r>
+        <w:rPr>
+          <w:i/>
+          <w:iCs/>
+          <w:lang w:val="en-US"/>
+        </w:rPr>
+        <w:t>Note: I had to connect a different microcontroller to get pictures of the serial monitor.  Your interface and available baud rates may be slightly different</w:t>
+      </w:r>
+    </w:p>
+    <w:p>
+      <w:pPr>
+        <w:rPr>
+          <w:lang w:val="en-US"/>
+        </w:rPr>
+      </w:pPr>
+    </w:p>
+    <w:p>
+      <w:pPr>
+        <w:rPr>
+          <w:b/>
+          <w:bCs/>
+          <w:u w:val="single"/>
+          <w:lang w:val="en-US"/>
+        </w:rPr>
+      </w:pPr>
+      <w:r>
+        <w:rPr>
+          <w:b/>
+          <w:bCs/>
+          <w:u w:val="single"/>
+          <w:lang w:val="en-US"/>
+        </w:rPr>
+        <w:br w:type="page"/>
+      </w:r>
+    </w:p>
+    <w:p>
+      <w:pPr>
+        <w:rPr>
+          <w:u w:val="single"/>
+          <w:lang w:val="en-US"/>
+        </w:rPr>
+      </w:pPr>
+      <w:r>
+        <w:rPr>
+          <w:b/>
+          <w:bCs/>
+          <w:u w:val="single"/>
+          <w:lang w:val="en-US"/>
+        </w:rPr>
+        <w:lastRenderedPageBreak/>
+        <w:t>IMPORTANT: OBTAINING DATA FROM THE TEROS12</w:t>
+      </w:r>
+    </w:p>
+    <w:p>
+      <w:pPr>
+        <w:rPr>
+          <w:lang w:val="en-US"/>
+        </w:rPr>
+      </w:pPr>
+      <w:r>
+        <w:rPr>
+          <w:lang w:val="en-US"/>
+        </w:rPr>
+        <w:t xml:space="preserve">The TEROS12 does </w:t>
+      </w:r>
+      <w:r>
+        <w:rPr>
+          <w:b/>
+          <w:bCs/>
+          <w:lang w:val="en-US"/>
+        </w:rPr>
+        <w:t>not</w:t>
+      </w:r>
+      <w:r>
+        <w:rPr>
+          <w:lang w:val="en-US"/>
+        </w:rPr>
+        <w:t xml:space="preserve"> send data </w:t>
+      </w:r>
+      <w:proofErr w:type="gramStart"/>
+      <w:r>
+        <w:rPr>
+          <w:lang w:val="en-US"/>
+        </w:rPr>
+        <w:t>automatically, and</w:t>
+      </w:r>
+      <w:proofErr w:type="gramEnd"/>
+      <w:r>
+        <w:rPr>
+          <w:lang w:val="en-US"/>
+        </w:rPr>
+        <w:t xml:space="preserve"> will only send data when power is cycled.  We are emulating this through the limit switch, which essentially gives the TEROS12 power each time it is pressed!</w:t>
+      </w:r>
+    </w:p>
+    <w:p>
+      <w:pPr>
+        <w:rPr>
+          <w:lang w:val="en-US"/>
+        </w:rPr>
+      </w:pPr>
+      <w:r>
+        <w:rPr>
+          <w:lang w:val="en-US"/>
+        </w:rPr>
+        <w:t xml:space="preserve">To view information from </w:t>
+      </w:r>
+      <w:proofErr w:type="gramStart"/>
+      <w:r>
+        <w:rPr>
+          <w:lang w:val="en-US"/>
+        </w:rPr>
+        <w:t>the TEROS12</w:t>
+      </w:r>
+      <w:proofErr w:type="gramEnd"/>
+      <w:r>
+        <w:rPr>
+          <w:lang w:val="en-US"/>
+        </w:rPr>
+        <w:t>, follow these steps:</w:t>
+      </w:r>
+    </w:p>
+    <w:p>
+      <w:pPr>
+        <w:pStyle w:val="ListParagraph"/>
+        <w:numPr>
+          <w:ilvl w:val="0"/>
+          <w:numId w:val="1"/>
+        </w:numPr>
+        <w:rPr>
+          <w:lang w:val="en-US"/>
+        </w:rPr>
+      </w:pPr>
+      <w:r>
+        <w:rPr>
+          <w:lang w:val="en-US"/>
+        </w:rPr>
+        <w:t xml:space="preserve">Ensure the Blue Pill is connected to the computer over USB (not via the </w:t>
+      </w:r>
+      <w:proofErr w:type="spellStart"/>
+      <w:r>
+        <w:rPr>
+          <w:lang w:val="en-US"/>
+        </w:rPr>
+        <w:t>STLink</w:t>
+      </w:r>
+      <w:proofErr w:type="spellEnd"/>
+      <w:r>
+        <w:rPr>
+          <w:lang w:val="en-US"/>
+        </w:rPr>
+        <w:t xml:space="preserve"> v2)</w:t>
+      </w:r>
+    </w:p>
+    <w:p>
+      <w:pPr>
+        <w:pStyle w:val="ListParagraph"/>
+        <w:numPr>
+          <w:ilvl w:val="0"/>
+          <w:numId w:val="1"/>
+        </w:numPr>
+        <w:rPr>
+          <w:lang w:val="en-US"/>
+        </w:rPr>
+      </w:pPr>
+      <w:r>
+        <w:rPr>
+          <w:lang w:val="en-US"/>
+        </w:rPr>
+        <w:t>Press and hold the limit switch until a new line shows in the Serial Monitor</w:t>
+      </w:r>
+    </w:p>
+    <w:p>
+      <w:pPr>
+        <w:pStyle w:val="ListParagraph"/>
+        <w:numPr>
+          <w:ilvl w:val="0"/>
+          <w:numId w:val="1"/>
+        </w:numPr>
+        <w:rPr>
+          <w:lang w:val="en-US"/>
+        </w:rPr>
+      </w:pPr>
+      <w:r>
+        <w:rPr>
+          <w:lang w:val="en-US"/>
+        </w:rPr>
+        <w:t>Release the limit switch.</w:t>
+      </w:r>
+    </w:p>
+    <w:p>
+      <w:pPr>
+        <w:pStyle w:val="ListParagraph"/>
+        <w:numPr>
+          <w:ilvl w:val="0"/>
+          <w:numId w:val="1"/>
+        </w:numPr>
+        <w:rPr>
+          <w:lang w:val="en-US"/>
+        </w:rPr>
+      </w:pPr>
+      <w:r>
+        <w:rPr>
+          <w:lang w:val="en-US"/>
+        </w:rPr>
+        <w:t>Repeat steps 2-3 for subsequent data values.</w:t>
+      </w:r>
+    </w:p>
+    <w:p>
+      <w:pPr>
+        <w:rPr>
+          <w:lang w:val="en-US"/>
+        </w:rPr>
+      </w:pPr>
+    </w:p>
+    <w:p>
+      <w:pPr>
+        <w:rPr>
+          <w:lang w:val="en-US"/>
+        </w:rPr>
+      </w:pPr>
+      <w:r>
+        <w:rPr>
+          <w:lang w:val="en-US"/>
+        </w:rPr>
+        <w:t>To disable the system, simply unplug the USB cable from your computer!</w:t>
+      </w:r>
+    </w:p>
+    <w:p>
+      <w:pPr>
+        <w:rPr>
+          <w:lang w:val="en-US"/>
+        </w:rPr>
+      </w:pPr>
+    </w:p>
+    <w:p>
+      <w:pPr>
+        <w:rPr>
+          <w:lang w:val="en-US"/>
+        </w:rPr>
+      </w:pPr>
+      <w:r>
+        <w:rPr>
+          <w:lang w:val="en-US"/>
+        </w:rPr>
+        <w:t>If you have any questions, do not hesitate to reach out to me on Teams either directly or via the sensors group chat!</w:t>
       </w:r>
     </w:p>
     <w:sectPr>
@@ -835,8 +3291,123 @@
       </w:rPr>
     </w:lvl>
   </w:abstractNum>
+  <w:abstractNum w:abstractNumId="1" w15:restartNumberingAfterBreak="0">
+    <w:nsid w:val="6C0F5A59"/>
+    <w:multiLevelType w:val="hybridMultilevel"/>
+    <w:tmpl w:val="5F5E16B0"/>
+    <w:lvl w:ilvl="0" w:tplc="080AB4D8">
+      <w:numFmt w:val="bullet"/>
+      <w:lvlText w:val="-"/>
+      <w:lvlJc w:val="left"/>
+      <w:pPr>
+        <w:ind w:left="720" w:hanging="360"/>
+      </w:pPr>
+      <w:rPr>
+        <w:rFonts w:ascii="Aptos" w:eastAsiaTheme="minorHAnsi" w:hAnsi="Aptos" w:cstheme="minorBidi" w:hint="default"/>
+      </w:rPr>
+    </w:lvl>
+    <w:lvl w:ilvl="1" w:tplc="10090003" w:tentative="1">
+      <w:start w:val="1"/>
+      <w:numFmt w:val="bullet"/>
+      <w:lvlText w:val="o"/>
+      <w:lvlJc w:val="left"/>
+      <w:pPr>
+        <w:ind w:left="1440" w:hanging="360"/>
+      </w:pPr>
+      <w:rPr>
+        <w:rFonts w:ascii="Courier New" w:hAnsi="Courier New" w:cs="Courier New" w:hint="default"/>
+      </w:rPr>
+    </w:lvl>
+    <w:lvl w:ilvl="2" w:tplc="10090005" w:tentative="1">
+      <w:start w:val="1"/>
+      <w:numFmt w:val="bullet"/>
+      <w:lvlText w:val=""/>
+      <w:lvlJc w:val="left"/>
+      <w:pPr>
+        <w:ind w:left="2160" w:hanging="360"/>
+      </w:pPr>
+      <w:rPr>
+        <w:rFonts w:ascii="Wingdings" w:hAnsi="Wingdings" w:hint="default"/>
+      </w:rPr>
+    </w:lvl>
+    <w:lvl w:ilvl="3" w:tplc="10090001" w:tentative="1">
+      <w:start w:val="1"/>
+      <w:numFmt w:val="bullet"/>
+      <w:lvlText w:val=""/>
+      <w:lvlJc w:val="left"/>
+      <w:pPr>
+        <w:ind w:left="2880" w:hanging="360"/>
+      </w:pPr>
+      <w:rPr>
+        <w:rFonts w:ascii="Symbol" w:hAnsi="Symbol" w:hint="default"/>
+      </w:rPr>
+    </w:lvl>
+    <w:lvl w:ilvl="4" w:tplc="10090003" w:tentative="1">
+      <w:start w:val="1"/>
+      <w:numFmt w:val="bullet"/>
+      <w:lvlText w:val="o"/>
+      <w:lvlJc w:val="left"/>
+      <w:pPr>
+        <w:ind w:left="3600" w:hanging="360"/>
+      </w:pPr>
+      <w:rPr>
+        <w:rFonts w:ascii="Courier New" w:hAnsi="Courier New" w:cs="Courier New" w:hint="default"/>
+      </w:rPr>
+    </w:lvl>
+    <w:lvl w:ilvl="5" w:tplc="10090005" w:tentative="1">
+      <w:start w:val="1"/>
+      <w:numFmt w:val="bullet"/>
+      <w:lvlText w:val=""/>
+      <w:lvlJc w:val="left"/>
+      <w:pPr>
+        <w:ind w:left="4320" w:hanging="360"/>
+      </w:pPr>
+      <w:rPr>
+        <w:rFonts w:ascii="Wingdings" w:hAnsi="Wingdings" w:hint="default"/>
+      </w:rPr>
+    </w:lvl>
+    <w:lvl w:ilvl="6" w:tplc="10090001" w:tentative="1">
+      <w:start w:val="1"/>
+      <w:numFmt w:val="bullet"/>
+      <w:lvlText w:val=""/>
+      <w:lvlJc w:val="left"/>
+      <w:pPr>
+        <w:ind w:left="5040" w:hanging="360"/>
+      </w:pPr>
+      <w:rPr>
+        <w:rFonts w:ascii="Symbol" w:hAnsi="Symbol" w:hint="default"/>
+      </w:rPr>
+    </w:lvl>
+    <w:lvl w:ilvl="7" w:tplc="10090003" w:tentative="1">
+      <w:start w:val="1"/>
+      <w:numFmt w:val="bullet"/>
+      <w:lvlText w:val="o"/>
+      <w:lvlJc w:val="left"/>
+      <w:pPr>
+        <w:ind w:left="5760" w:hanging="360"/>
+      </w:pPr>
+      <w:rPr>
+        <w:rFonts w:ascii="Courier New" w:hAnsi="Courier New" w:cs="Courier New" w:hint="default"/>
+      </w:rPr>
+    </w:lvl>
+    <w:lvl w:ilvl="8" w:tplc="10090005" w:tentative="1">
+      <w:start w:val="1"/>
+      <w:numFmt w:val="bullet"/>
+      <w:lvlText w:val=""/>
+      <w:lvlJc w:val="left"/>
+      <w:pPr>
+        <w:ind w:left="6480" w:hanging="360"/>
+      </w:pPr>
+      <w:rPr>
+        <w:rFonts w:ascii="Wingdings" w:hAnsi="Wingdings" w:hint="default"/>
+      </w:rPr>
+    </w:lvl>
+  </w:abstractNum>
   <w:num w:numId="1" w16cid:durableId="1180310618">
     <w:abstractNumId w:val="0"/>
+  </w:num>
+  <w:num w:numId="2" w16cid:durableId="1993947349">
+    <w:abstractNumId w:val="1"/>
   </w:num>
 </w:numbering>
 </file>
@@ -1444,6 +4015,7 @@
   <w:style w:type="character" w:default="1" w:styleId="DefaultParagraphFont">
     <w:name w:val="Default Paragraph Font"/>
     <w:uiPriority w:val="1"/>
+    <w:semiHidden/>
     <w:unhideWhenUsed/>
   </w:style>
   <w:style w:type="table" w:default="1" w:styleId="TableNormal">
@@ -1780,6 +4352,37 @@
       <w:shd w:val="clear" w:color="auto" w:fill="E1DFDD"/>
     </w:rPr>
   </w:style>
+  <w:style w:type="character" w:styleId="FollowedHyperlink">
+    <w:name w:val="FollowedHyperlink"/>
+    <w:basedOn w:val="DefaultParagraphFont"/>
+    <w:uiPriority w:val="99"/>
+    <w:semiHidden/>
+    <w:unhideWhenUsed/>
+    <w:rsid w:val="003D1D93"/>
+    <w:rPr>
+      <w:color w:val="96607D" w:themeColor="followedHyperlink"/>
+      <w:u w:val="single"/>
+    </w:rPr>
+  </w:style>
+  <w:style w:type="table" w:styleId="TableGrid">
+    <w:name w:val="Table Grid"/>
+    <w:basedOn w:val="TableNormal"/>
+    <w:uiPriority w:val="39"/>
+    <w:rsid w:val="003F0E9E"/>
+    <w:pPr>
+      <w:spacing w:after="0" w:line="240" w:lineRule="auto"/>
+    </w:pPr>
+    <w:tblPr>
+      <w:tblBorders>
+        <w:top w:val="single" w:sz="4" w:space="0" w:color="auto"/>
+        <w:left w:val="single" w:sz="4" w:space="0" w:color="auto"/>
+        <w:bottom w:val="single" w:sz="4" w:space="0" w:color="auto"/>
+        <w:right w:val="single" w:sz="4" w:space="0" w:color="auto"/>
+        <w:insideH w:val="single" w:sz="4" w:space="0" w:color="auto"/>
+        <w:insideV w:val="single" w:sz="4" w:space="0" w:color="auto"/>
+      </w:tblBorders>
+    </w:tblPr>
+  </w:style>
 </w:styles>
 </file>
 

</xml_diff>